<commit_message>
Rework the plugin to work in a similar way to "edguidance" Fixes #2
</commit_message>
<xml_diff>
--- a/docs/Embedded Polls - User Experience Preview.docx
+++ b/docs/Embedded Polls - User Experience Preview.docx
@@ -54,7 +54,6 @@
           <w:noProof/>
           <w:kern w:val="2"/>
           <w:lang w:val="en-NZ" w:eastAsia="en-NZ"/>
-          <w14:ligatures w14:val="standardContextual"/>
         </w:rPr>
       </w:pPr>
       <w:r>
@@ -75,7 +74,7 @@
         </w:rPr>
         <w:fldChar w:fldCharType="separate"/>
       </w:r>
-      <w:hyperlink w:anchor="_Toc233545418" w:history="1">
+      <w:hyperlink w:anchor="_Toc900000001" w:history="1">
         <w:r>
           <w:rPr>
             <w:rStyle w:val="Hyperlink"/>
@@ -103,13 +102,7 @@
             <w:noProof/>
             <w:webHidden/>
           </w:rPr>
-          <w:instrText xml:space="preserve"> PAGEREF _Toc233545418 \h </w:instrText>
-        </w:r>
-        <w:r>
-          <w:rPr>
-            <w:noProof/>
-            <w:webHidden/>
-          </w:rPr>
+          <w:instrText xml:space="preserve"> PAGEREF _Toc900000001 \h </w:instrText>
         </w:r>
         <w:r>
           <w:rPr>
@@ -144,17 +137,16 @@
           <w:noProof/>
           <w:kern w:val="2"/>
           <w:lang w:val="en-NZ" w:eastAsia="en-NZ"/>
-          <w14:ligatures w14:val="standardContextual"/>
-        </w:rPr>
-      </w:pPr>
-      <w:hyperlink w:anchor="_Toc233545419" w:history="1">
+        </w:rPr>
+      </w:pPr>
+      <w:hyperlink w:anchor="_Toc900000002" w:history="1">
         <w:r>
           <w:rPr>
             <w:rStyle w:val="Hyperlink"/>
             <w:noProof/>
             <w:lang w:val="en-NZ"/>
           </w:rPr>
-          <w:t>Syntax</w:t>
+          <w:t>Adding a poll</w:t>
         </w:r>
         <w:r>
           <w:rPr>
@@ -175,13 +167,7 @@
             <w:noProof/>
             <w:webHidden/>
           </w:rPr>
-          <w:instrText xml:space="preserve"> PAGEREF _Toc233545419 \h </w:instrText>
-        </w:r>
-        <w:r>
-          <w:rPr>
-            <w:noProof/>
-            <w:webHidden/>
-          </w:rPr>
+          <w:instrText xml:space="preserve"> PAGEREF _Toc900000002 \h </w:instrText>
         </w:r>
         <w:r>
           <w:rPr>
@@ -195,7 +181,202 @@
             <w:noProof/>
             <w:webHidden/>
           </w:rPr>
-          <w:t>1</w:t>
+          <w:t>2</w:t>
+        </w:r>
+        <w:r>
+          <w:rPr>
+            <w:noProof/>
+            <w:webHidden/>
+          </w:rPr>
+          <w:fldChar w:fldCharType="end"/>
+        </w:r>
+      </w:hyperlink>
+    </w:p>
+    <w:p>
+      <w:pPr>
+        <w:pStyle w:val="TOC2"/>
+        <w:tabs>
+          <w:tab w:val="right" w:leader="dot" w:pos="9016"/>
+        </w:tabs>
+        <w:rPr>
+          <w:noProof/>
+          <w:kern w:val="2"/>
+          <w:lang w:val="en-NZ" w:eastAsia="en-NZ"/>
+        </w:rPr>
+      </w:pPr>
+      <w:hyperlink w:anchor="_Toc900000003" w:history="1">
+        <w:r>
+          <w:rPr>
+            <w:rStyle w:val="Hyperlink"/>
+            <w:noProof/>
+            <w:lang w:val="en-NZ"/>
+          </w:rPr>
+          <w:t>Rules</w:t>
+        </w:r>
+        <w:r>
+          <w:rPr>
+            <w:noProof/>
+            <w:webHidden/>
+          </w:rPr>
+          <w:tab/>
+        </w:r>
+        <w:r>
+          <w:rPr>
+            <w:noProof/>
+            <w:webHidden/>
+          </w:rPr>
+          <w:fldChar w:fldCharType="begin"/>
+        </w:r>
+        <w:r>
+          <w:rPr>
+            <w:noProof/>
+            <w:webHidden/>
+          </w:rPr>
+          <w:instrText xml:space="preserve"> PAGEREF _Toc900000003 \h </w:instrText>
+        </w:r>
+        <w:r>
+          <w:rPr>
+            <w:noProof/>
+            <w:webHidden/>
+          </w:rPr>
+          <w:fldChar w:fldCharType="separate"/>
+        </w:r>
+        <w:r>
+          <w:rPr>
+            <w:noProof/>
+            <w:webHidden/>
+          </w:rPr>
+          <w:t>3</w:t>
+        </w:r>
+        <w:r>
+          <w:rPr>
+            <w:noProof/>
+            <w:webHidden/>
+          </w:rPr>
+          <w:fldChar w:fldCharType="end"/>
+        </w:r>
+      </w:hyperlink>
+    </w:p>
+    <w:p>
+      <w:pPr>
+        <w:pStyle w:val="TOC2"/>
+        <w:tabs>
+          <w:tab w:val="right" w:leader="dot" w:pos="9016"/>
+        </w:tabs>
+        <w:rPr>
+          <w:noProof/>
+          <w:kern w:val="2"/>
+          <w:lang w:val="en-NZ" w:eastAsia="en-NZ"/>
+        </w:rPr>
+      </w:pPr>
+      <w:hyperlink w:anchor="_Toc900000004" w:history="1">
+        <w:r>
+          <w:rPr>
+            <w:rStyle w:val="Hyperlink"/>
+            <w:noProof/>
+            <w:lang w:val="en-NZ"/>
+          </w:rPr>
+          <w:t>Examples</w:t>
+        </w:r>
+        <w:r>
+          <w:rPr>
+            <w:noProof/>
+            <w:webHidden/>
+          </w:rPr>
+          <w:tab/>
+        </w:r>
+        <w:r>
+          <w:rPr>
+            <w:noProof/>
+            <w:webHidden/>
+          </w:rPr>
+          <w:fldChar w:fldCharType="begin"/>
+        </w:r>
+        <w:r>
+          <w:rPr>
+            <w:noProof/>
+            <w:webHidden/>
+          </w:rPr>
+          <w:instrText xml:space="preserve"> PAGEREF _Toc900000004 \h </w:instrText>
+        </w:r>
+        <w:r>
+          <w:rPr>
+            <w:noProof/>
+            <w:webHidden/>
+          </w:rPr>
+          <w:fldChar w:fldCharType="separate"/>
+        </w:r>
+        <w:r>
+          <w:rPr>
+            <w:noProof/>
+            <w:webHidden/>
+          </w:rPr>
+          <w:t>3</w:t>
+        </w:r>
+        <w:r>
+          <w:rPr>
+            <w:noProof/>
+            <w:webHidden/>
+          </w:rPr>
+          <w:fldChar w:fldCharType="end"/>
+        </w:r>
+      </w:hyperlink>
+    </w:p>
+    <w:p>
+      <w:pPr>
+        <w:pStyle w:val="TOC2"/>
+        <w:tabs>
+          <w:tab w:val="right" w:leader="dot" w:pos="9016"/>
+        </w:tabs>
+        <w:rPr>
+          <w:noProof/>
+          <w:kern w:val="2"/>
+          <w:lang w:val="en-NZ" w:eastAsia="en-NZ"/>
+        </w:rPr>
+      </w:pPr>
+      <w:hyperlink w:anchor="_Toc900000005" w:history="1">
+        <w:r>
+          <w:rPr>
+            <w:rStyle w:val="Hyperlink"/>
+            <w:noProof/>
+            <w:lang w:val="en-NZ"/>
+          </w:rPr>
+          <w:t>Tips</w:t>
+        </w:r>
+        <w:r>
+          <w:rPr>
+            <w:noProof/>
+            <w:webHidden/>
+          </w:rPr>
+          <w:tab/>
+        </w:r>
+        <w:r>
+          <w:rPr>
+            <w:noProof/>
+            <w:webHidden/>
+          </w:rPr>
+          <w:fldChar w:fldCharType="begin"/>
+        </w:r>
+        <w:r>
+          <w:rPr>
+            <w:noProof/>
+            <w:webHidden/>
+          </w:rPr>
+          <w:instrText xml:space="preserve"> PAGEREF _Toc900000005 \h </w:instrText>
+        </w:r>
+        <w:r>
+          <w:rPr>
+            <w:noProof/>
+            <w:webHidden/>
+          </w:rPr>
+          <w:fldChar w:fldCharType="separate"/>
+        </w:r>
+        <w:r>
+          <w:rPr>
+            <w:noProof/>
+            <w:webHidden/>
+          </w:rPr>
+          <w:t>4</w:t>
         </w:r>
         <w:r>
           <w:rPr>
@@ -216,17 +397,16 @@
           <w:noProof/>
           <w:kern w:val="2"/>
           <w:lang w:val="en-NZ" w:eastAsia="en-NZ"/>
-          <w14:ligatures w14:val="standardContextual"/>
-        </w:rPr>
-      </w:pPr>
-      <w:hyperlink w:anchor="_Toc233545420" w:history="1">
+        </w:rPr>
+      </w:pPr>
+      <w:hyperlink w:anchor="_Toc900000006" w:history="1">
         <w:r>
           <w:rPr>
             <w:rStyle w:val="Hyperlink"/>
             <w:noProof/>
             <w:lang w:val="en-NZ"/>
           </w:rPr>
-          <w:t>Teacher view</w:t>
+          <w:t>Editing, moving and deleting a poll</w:t>
         </w:r>
         <w:r>
           <w:rPr>
@@ -247,13 +427,7 @@
             <w:noProof/>
             <w:webHidden/>
           </w:rPr>
-          <w:instrText xml:space="preserve"> PAGEREF _Toc233545420 \h </w:instrText>
-        </w:r>
-        <w:r>
-          <w:rPr>
-            <w:noProof/>
-            <w:webHidden/>
-          </w:rPr>
+          <w:instrText xml:space="preserve"> PAGEREF _Toc900000006 \h </w:instrText>
         </w:r>
         <w:r>
           <w:rPr>
@@ -267,7 +441,72 @@
             <w:noProof/>
             <w:webHidden/>
           </w:rPr>
-          <w:t>2</w:t>
+          <w:t>4</w:t>
+        </w:r>
+        <w:r>
+          <w:rPr>
+            <w:noProof/>
+            <w:webHidden/>
+          </w:rPr>
+          <w:fldChar w:fldCharType="end"/>
+        </w:r>
+      </w:hyperlink>
+    </w:p>
+    <w:p>
+      <w:pPr>
+        <w:pStyle w:val="TOC2"/>
+        <w:tabs>
+          <w:tab w:val="right" w:leader="dot" w:pos="9016"/>
+        </w:tabs>
+        <w:rPr>
+          <w:noProof/>
+          <w:kern w:val="2"/>
+          <w:lang w:val="en-NZ" w:eastAsia="en-NZ"/>
+        </w:rPr>
+      </w:pPr>
+      <w:hyperlink w:anchor="_Toc900000007" w:history="1">
+        <w:r>
+          <w:rPr>
+            <w:rStyle w:val="Hyperlink"/>
+            <w:noProof/>
+            <w:lang w:val="en-NZ"/>
+          </w:rPr>
+          <w:t>Editing a poll that has votes</w:t>
+        </w:r>
+        <w:r>
+          <w:rPr>
+            <w:noProof/>
+            <w:webHidden/>
+          </w:rPr>
+          <w:tab/>
+        </w:r>
+        <w:r>
+          <w:rPr>
+            <w:noProof/>
+            <w:webHidden/>
+          </w:rPr>
+          <w:fldChar w:fldCharType="begin"/>
+        </w:r>
+        <w:r>
+          <w:rPr>
+            <w:noProof/>
+            <w:webHidden/>
+          </w:rPr>
+          <w:instrText xml:space="preserve"> PAGEREF _Toc900000007 \h </w:instrText>
+        </w:r>
+        <w:r>
+          <w:rPr>
+            <w:noProof/>
+            <w:webHidden/>
+          </w:rPr>
+          <w:fldChar w:fldCharType="separate"/>
+        </w:r>
+        <w:r>
+          <w:rPr>
+            <w:noProof/>
+            <w:webHidden/>
+          </w:rPr>
+          <w:t>5</w:t>
         </w:r>
         <w:r>
           <w:rPr>
@@ -288,17 +527,16 @@
           <w:noProof/>
           <w:kern w:val="2"/>
           <w:lang w:val="en-NZ" w:eastAsia="en-NZ"/>
-          <w14:ligatures w14:val="standardContextual"/>
-        </w:rPr>
-      </w:pPr>
-      <w:hyperlink w:anchor="_Toc233545421" w:history="1">
+        </w:rPr>
+      </w:pPr>
+      <w:hyperlink w:anchor="_Toc900000008" w:history="1">
         <w:r>
           <w:rPr>
             <w:rStyle w:val="Hyperlink"/>
             <w:noProof/>
             <w:lang w:val="en-NZ"/>
           </w:rPr>
-          <w:t>Student view</w:t>
+          <w:t>Teacher view</w:t>
         </w:r>
         <w:r>
           <w:rPr>
@@ -319,13 +557,7 @@
             <w:noProof/>
             <w:webHidden/>
           </w:rPr>
-          <w:instrText xml:space="preserve"> PAGEREF _Toc233545421 \h </w:instrText>
-        </w:r>
-        <w:r>
-          <w:rPr>
-            <w:noProof/>
-            <w:webHidden/>
-          </w:rPr>
+          <w:instrText xml:space="preserve"> PAGEREF _Toc900000008 \h </w:instrText>
         </w:r>
         <w:r>
           <w:rPr>
@@ -339,7 +571,7 @@
             <w:noProof/>
             <w:webHidden/>
           </w:rPr>
-          <w:t>3</w:t>
+          <w:t>6</w:t>
         </w:r>
         <w:r>
           <w:rPr>
@@ -360,17 +592,16 @@
           <w:noProof/>
           <w:kern w:val="2"/>
           <w:lang w:val="en-NZ" w:eastAsia="en-NZ"/>
-          <w14:ligatures w14:val="standardContextual"/>
-        </w:rPr>
-      </w:pPr>
-      <w:hyperlink w:anchor="_Toc233545422" w:history="1">
+        </w:rPr>
+      </w:pPr>
+      <w:hyperlink w:anchor="_Toc900000009" w:history="1">
         <w:r>
           <w:rPr>
             <w:rStyle w:val="Hyperlink"/>
             <w:noProof/>
             <w:lang w:val="en-NZ"/>
           </w:rPr>
-          <w:t>Multiple polls</w:t>
+          <w:t>Student view</w:t>
         </w:r>
         <w:r>
           <w:rPr>
@@ -391,13 +622,7 @@
             <w:noProof/>
             <w:webHidden/>
           </w:rPr>
-          <w:instrText xml:space="preserve"> PAGEREF _Toc233545422 \h </w:instrText>
-        </w:r>
-        <w:r>
-          <w:rPr>
-            <w:noProof/>
-            <w:webHidden/>
-          </w:rPr>
+          <w:instrText xml:space="preserve"> PAGEREF _Toc900000009 \h </w:instrText>
         </w:r>
         <w:r>
           <w:rPr>
@@ -411,7 +636,7 @@
             <w:noProof/>
             <w:webHidden/>
           </w:rPr>
-          <w:t>4</w:t>
+          <w:t>7</w:t>
         </w:r>
         <w:r>
           <w:rPr>
@@ -432,17 +657,16 @@
           <w:noProof/>
           <w:kern w:val="2"/>
           <w:lang w:val="en-NZ" w:eastAsia="en-NZ"/>
-          <w14:ligatures w14:val="standardContextual"/>
-        </w:rPr>
-      </w:pPr>
-      <w:hyperlink w:anchor="_Toc233545423" w:history="1">
+        </w:rPr>
+      </w:pPr>
+      <w:hyperlink w:anchor="_Toc900000010" w:history="1">
         <w:r>
           <w:rPr>
             <w:rStyle w:val="Hyperlink"/>
             <w:noProof/>
             <w:lang w:val="en-NZ"/>
           </w:rPr>
-          <w:t>Compatible with C4L components</w:t>
+          <w:t>Multiple polls</w:t>
         </w:r>
         <w:r>
           <w:rPr>
@@ -463,13 +687,7 @@
             <w:noProof/>
             <w:webHidden/>
           </w:rPr>
-          <w:instrText xml:space="preserve"> PAGEREF _Toc233545423 \h </w:instrText>
-        </w:r>
-        <w:r>
-          <w:rPr>
-            <w:noProof/>
-            <w:webHidden/>
-          </w:rPr>
+          <w:instrText xml:space="preserve"> PAGEREF _Toc900000010 \h </w:instrText>
         </w:r>
         <w:r>
           <w:rPr>
@@ -483,7 +701,7 @@
             <w:noProof/>
             <w:webHidden/>
           </w:rPr>
-          <w:t>6</w:t>
+          <w:t>9</w:t>
         </w:r>
         <w:r>
           <w:rPr>
@@ -504,17 +722,16 @@
           <w:noProof/>
           <w:kern w:val="2"/>
           <w:lang w:val="en-NZ" w:eastAsia="en-NZ"/>
-          <w14:ligatures w14:val="standardContextual"/>
-        </w:rPr>
-      </w:pPr>
-      <w:hyperlink w:anchor="_Toc233545424" w:history="1">
+        </w:rPr>
+      </w:pPr>
+      <w:hyperlink w:anchor="_Toc900000011" w:history="1">
         <w:r>
           <w:rPr>
             <w:rStyle w:val="Hyperlink"/>
             <w:noProof/>
             <w:lang w:val="en-NZ"/>
           </w:rPr>
-          <w:t>Editor view</w:t>
+          <w:t>Compatible with C4L components</w:t>
         </w:r>
         <w:r>
           <w:rPr>
@@ -535,13 +752,7 @@
             <w:noProof/>
             <w:webHidden/>
           </w:rPr>
-          <w:instrText xml:space="preserve"> PAGEREF _Toc233545424 \h </w:instrText>
-        </w:r>
-        <w:r>
-          <w:rPr>
-            <w:noProof/>
-            <w:webHidden/>
-          </w:rPr>
+          <w:instrText xml:space="preserve"> PAGEREF _Toc900000011 \h </w:instrText>
         </w:r>
         <w:r>
           <w:rPr>
@@ -555,7 +766,7 @@
             <w:noProof/>
             <w:webHidden/>
           </w:rPr>
-          <w:t>7</w:t>
+          <w:t>11</w:t>
         </w:r>
         <w:r>
           <w:rPr>
@@ -576,10 +787,9 @@
           <w:noProof/>
           <w:kern w:val="2"/>
           <w:lang w:val="en-NZ" w:eastAsia="en-NZ"/>
-          <w14:ligatures w14:val="standardContextual"/>
-        </w:rPr>
-      </w:pPr>
-      <w:hyperlink w:anchor="_Toc233545425" w:history="1">
+        </w:rPr>
+      </w:pPr>
+      <w:hyperlink w:anchor="_Toc900000012" w:history="1">
         <w:r>
           <w:rPr>
             <w:rStyle w:val="Hyperlink"/>
@@ -607,13 +817,7 @@
             <w:noProof/>
             <w:webHidden/>
           </w:rPr>
-          <w:instrText xml:space="preserve"> PAGEREF _Toc233545425 \h </w:instrText>
-        </w:r>
-        <w:r>
-          <w:rPr>
-            <w:noProof/>
-            <w:webHidden/>
-          </w:rPr>
+          <w:instrText xml:space="preserve"> PAGEREF _Toc900000012 \h </w:instrText>
         </w:r>
         <w:r>
           <w:rPr>
@@ -627,7 +831,7 @@
             <w:noProof/>
             <w:webHidden/>
           </w:rPr>
-          <w:t>7</w:t>
+          <w:t>11</w:t>
         </w:r>
         <w:r>
           <w:rPr>
@@ -640,6 +844,71 @@
     </w:p>
     <w:p>
       <w:pPr>
+        <w:pStyle w:val="TOC1"/>
+        <w:tabs>
+          <w:tab w:val="right" w:leader="dot" w:pos="9016"/>
+        </w:tabs>
+        <w:rPr>
+          <w:noProof/>
+          <w:kern w:val="2"/>
+          <w:lang w:val="en-NZ" w:eastAsia="en-NZ"/>
+        </w:rPr>
+      </w:pPr>
+      <w:hyperlink w:anchor="_Toc900000013" w:history="1">
+        <w:r>
+          <w:rPr>
+            <w:rStyle w:val="Hyperlink"/>
+            <w:noProof/>
+            <w:lang w:val="en-NZ"/>
+          </w:rPr>
+          <w:t>Testing samples</w:t>
+        </w:r>
+        <w:r>
+          <w:rPr>
+            <w:noProof/>
+            <w:webHidden/>
+          </w:rPr>
+          <w:tab/>
+        </w:r>
+        <w:r>
+          <w:rPr>
+            <w:noProof/>
+            <w:webHidden/>
+          </w:rPr>
+          <w:fldChar w:fldCharType="begin"/>
+        </w:r>
+        <w:r>
+          <w:rPr>
+            <w:noProof/>
+            <w:webHidden/>
+          </w:rPr>
+          <w:instrText xml:space="preserve"> PAGEREF _Toc900000013 \h </w:instrText>
+        </w:r>
+        <w:r>
+          <w:rPr>
+            <w:noProof/>
+            <w:webHidden/>
+          </w:rPr>
+          <w:fldChar w:fldCharType="separate"/>
+        </w:r>
+        <w:r>
+          <w:rPr>
+            <w:noProof/>
+            <w:webHidden/>
+          </w:rPr>
+          <w:t>12</w:t>
+        </w:r>
+        <w:r>
+          <w:rPr>
+            <w:noProof/>
+            <w:webHidden/>
+          </w:rPr>
+          <w:fldChar w:fldCharType="end"/>
+        </w:r>
+      </w:hyperlink>
+    </w:p>
+    <w:p>
+      <w:pPr>
         <w:rPr>
           <w:lang w:val="en-NZ"/>
         </w:rPr>
@@ -658,192 +927,92 @@
           <w:lang w:val="en-NZ"/>
         </w:rPr>
       </w:pPr>
-      <w:bookmarkStart w:id="0" w:name="_Toc233545418"/>
-      <w:r>
-        <w:rPr>
-          <w:lang w:val="en-NZ"/>
-        </w:rPr>
-        <w:t>Overview</w:t>
-      </w:r>
-      <w:bookmarkEnd w:id="0"/>
-    </w:p>
-    <w:p>
-      <w:pPr>
-        <w:rPr>
-          <w:lang w:val="en-NZ"/>
-        </w:rPr>
-      </w:pPr>
-      <w:r>
-        <w:rPr>
-          <w:lang w:val="en-NZ"/>
-        </w:rPr>
-        <w:t>The “Embed poll” feature enables a basic</w:t>
-      </w:r>
-      <w:r>
-        <w:rPr>
-          <w:lang w:val="en-NZ"/>
-        </w:rPr>
-        <w:t xml:space="preserve">, lightweight </w:t>
-      </w:r>
-      <w:r>
-        <w:rPr>
-          <w:lang w:val="en-NZ"/>
-        </w:rPr>
-        <w:t>poll to be embedded into a book chapter or label</w:t>
-      </w:r>
-      <w:r>
-        <w:rPr>
-          <w:lang w:val="en-NZ"/>
-        </w:rPr>
-        <w:t xml:space="preserve"> using </w:t>
-      </w:r>
-      <w:r>
-        <w:rPr>
-          <w:lang w:val="en-NZ"/>
-        </w:rPr>
-        <w:t xml:space="preserve">a simple </w:t>
-      </w:r>
-      <w:r>
-        <w:rPr>
-          <w:lang w:val="en-NZ"/>
-        </w:rPr>
-        <w:t>“filter codes” syntax.</w:t>
-      </w:r>
-    </w:p>
-    <w:p>
-      <w:pPr>
-        <w:rPr>
-          <w:lang w:val="en-NZ"/>
-        </w:rPr>
-      </w:pPr>
-      <w:r>
-        <w:rPr>
-          <w:lang w:val="en-NZ"/>
-        </w:rPr>
-        <w:t xml:space="preserve">This </w:t>
-      </w:r>
-      <w:r>
-        <w:rPr>
-          <w:lang w:val="en-NZ"/>
-        </w:rPr>
-        <w:t xml:space="preserve">feature provides </w:t>
-      </w:r>
-      <w:r>
-        <w:rPr>
-          <w:lang w:val="en-NZ"/>
-        </w:rPr>
-        <w:t>only the bare poll user interface</w:t>
-      </w:r>
-      <w:r>
-        <w:rPr>
-          <w:lang w:val="en-NZ"/>
-        </w:rPr>
-        <w:t>. The question, prompt, or description of the poll</w:t>
-      </w:r>
-      <w:r>
-        <w:rPr>
-          <w:lang w:val="en-NZ"/>
-        </w:rPr>
-        <w:t xml:space="preserve"> is </w:t>
-      </w:r>
-      <w:r>
-        <w:rPr>
-          <w:lang w:val="en-NZ"/>
-        </w:rPr>
-        <w:t>added outside or around the poll.</w:t>
-      </w:r>
-    </w:p>
-    <w:p>
-      <w:pPr>
-        <w:rPr>
-          <w:lang w:val="en-NZ"/>
-        </w:rPr>
-      </w:pPr>
-      <w:r>
-        <w:rPr>
-          <w:lang w:val="en-NZ"/>
-        </w:rPr>
-        <w:t>The poll's own appearance is fixed and can't be changed. However, you can place a poll inside a C4L component to make the poll and its accompanying text stand out visually</w:t>
-      </w:r>
-      <w:r>
-        <w:rPr>
-          <w:lang w:val="en-NZ"/>
-        </w:rPr>
-        <w:t>.</w:t>
-      </w:r>
-    </w:p>
-    <w:p>
-      <w:pPr>
-        <w:rPr>
-          <w:lang w:val="en-NZ"/>
-        </w:rPr>
-      </w:pPr>
-      <w:r>
-        <w:rPr>
-          <w:lang w:val="en-NZ"/>
-        </w:rPr>
-        <w:t>Polls “rollover”</w:t>
-      </w:r>
-      <w:r>
-        <w:rPr>
-          <w:lang w:val="en-NZ"/>
-        </w:rPr>
-        <w:t xml:space="preserve">. They </w:t>
-      </w:r>
-      <w:r>
-        <w:rPr>
-          <w:lang w:val="en-NZ"/>
-        </w:rPr>
-        <w:t xml:space="preserve">automatically </w:t>
-      </w:r>
-      <w:r>
-        <w:rPr>
-          <w:lang w:val="en-NZ"/>
-        </w:rPr>
-        <w:t>reset</w:t>
-      </w:r>
-      <w:r>
-        <w:rPr>
-          <w:lang w:val="en-NZ"/>
-        </w:rPr>
-        <w:t xml:space="preserve"> </w:t>
-      </w:r>
-      <w:r>
-        <w:rPr>
-          <w:lang w:val="en-NZ"/>
-        </w:rPr>
-        <w:t xml:space="preserve">and do not </w:t>
-      </w:r>
-      <w:r>
-        <w:rPr>
-          <w:lang w:val="en-NZ"/>
-        </w:rPr>
-        <w:t>require any teacher action before use</w:t>
-      </w:r>
-      <w:r>
-        <w:rPr>
-          <w:lang w:val="en-NZ"/>
-        </w:rPr>
-        <w:t>.</w:t>
-      </w:r>
-    </w:p>
-    <w:p>
-      <w:pPr>
-        <w:rPr>
-          <w:lang w:val="en-NZ"/>
-        </w:rPr>
-      </w:pPr>
-      <w:r>
-        <w:rPr>
-          <w:lang w:val="en-NZ"/>
-        </w:rPr>
-        <w:t xml:space="preserve">Students must respond to the poll before they can see the </w:t>
-      </w:r>
-      <w:r>
-        <w:rPr>
-          <w:lang w:val="en-NZ"/>
-        </w:rPr>
-        <w:t>results. This behaviour is fixed.</w:t>
+      <w:bookmarkStart w:id="100" w:name="_Toc900000001"/>
+      <w:r>
+        <w:rPr>
+          <w:lang w:val="en-NZ"/>
+        </w:rPr>
+        <w:t xml:space="preserve">Overview</w:t>
+      </w:r>
+      <w:bookmarkEnd w:id="100"/>
+    </w:p>
+    <w:p>
+      <w:pPr>
+        <w:rPr>
+          <w:lang w:val="en-NZ"/>
+        </w:rPr>
+      </w:pPr>
+      <w:r>
+        <w:rPr>
+          <w:lang w:val="en-NZ"/>
+        </w:rPr>
+        <w:t xml:space="preserve">The “Embed poll” feature enables a basic, lightweight poll to be embedded into a book chapter, label (text and media area), page, lesson page or course section summary. Teachers add and edit polls with the </w:t>
+      </w:r>
+      <w:r>
+        <w:rPr>
+          <w:b/>
+          <w:bCs/>
+          <w:lang w:val="en-NZ"/>
+        </w:rPr>
+        <w:t xml:space="preserve">Poll</w:t>
+      </w:r>
+      <w:r>
+        <w:rPr>
+          <w:lang w:val="en-NZ"/>
+        </w:rPr>
+        <w:t xml:space="preserve"> button in the text editor.</w:t>
+      </w:r>
+    </w:p>
+    <w:p>
+      <w:pPr>
+        <w:rPr>
+          <w:lang w:val="en-NZ"/>
+        </w:rPr>
+      </w:pPr>
+      <w:r>
+        <w:rPr>
+          <w:lang w:val="en-NZ"/>
+        </w:rPr>
+        <w:t xml:space="preserve">This feature provides only the bare poll user interface. The question, prompt, or description of the poll is added outside or around the poll.</w:t>
+      </w:r>
+    </w:p>
+    <w:p>
+      <w:pPr>
+        <w:rPr>
+          <w:lang w:val="en-NZ"/>
+        </w:rPr>
+      </w:pPr>
+      <w:r>
+        <w:rPr>
+          <w:lang w:val="en-NZ"/>
+        </w:rPr>
+        <w:t xml:space="preserve">The poll's own appearance is fixed and can't be changed. However, you can place a poll inside a C4L component to make the poll and its accompanying text stand out visually.</w:t>
+      </w:r>
+    </w:p>
+    <w:p>
+      <w:pPr>
+        <w:rPr>
+          <w:lang w:val="en-NZ"/>
+        </w:rPr>
+      </w:pPr>
+      <w:r>
+        <w:rPr>
+          <w:lang w:val="en-NZ"/>
+        </w:rPr>
+        <w:t xml:space="preserve">Polls “rollover”. When a course is copied for its next offering, its polls come across without any votes, and do not require any teacher action before use.</w:t>
+      </w:r>
+    </w:p>
+    <w:p>
+      <w:pPr>
+        <w:rPr>
+          <w:lang w:val="en-NZ"/>
+        </w:rPr>
+      </w:pPr>
+      <w:r>
+        <w:rPr>
+          <w:lang w:val="en-NZ"/>
+        </w:rPr>
+        <w:t xml:space="preserve">Students must respond to the poll before they can see the results. This behaviour is fixed.</w:t>
       </w:r>
     </w:p>
     <w:p>
@@ -853,249 +1022,74 @@
           <w:lang w:val="en-NZ"/>
         </w:rPr>
       </w:pPr>
-      <w:bookmarkStart w:id="1" w:name="_Toc233545419"/>
-      <w:r>
-        <w:rPr>
-          <w:lang w:val="en-NZ"/>
-        </w:rPr>
-        <w:t>Syntax</w:t>
-      </w:r>
-      <w:bookmarkEnd w:id="1"/>
-    </w:p>
-    <w:p>
-      <w:bookmarkStart w:id="2" w:name="_Toc233545420"/>
-      <w:r>
-        <w:t>{poll:"Option 1","Option 2","Option 3"}</w:t>
-      </w:r>
-    </w:p>
-    <w:p>
-      <w:pPr>
-        <w:pStyle w:val="Heading2"/>
-      </w:pPr>
-      <w:r>
-        <w:t>Rules</w:t>
-      </w:r>
-    </w:p>
-    <w:p>
-      <w:pPr>
+      <w:bookmarkStart w:id="101" w:name="_Toc900000002"/>
+      <w:r>
+        <w:rPr>
+          <w:lang w:val="en-NZ"/>
+        </w:rPr>
+        <w:t xml:space="preserve">Adding a poll</w:t>
+      </w:r>
+      <w:bookmarkEnd w:id="101"/>
+    </w:p>
+    <w:p>
+      <w:pPr>
+        <w:rPr>
+          <w:lang w:val="en-NZ"/>
+        </w:rPr>
+      </w:pPr>
+      <w:r>
+        <w:rPr>
+          <w:lang w:val="en-NZ"/>
+        </w:rPr>
+        <w:t xml:space="preserve">Polls are added in the text editor of a book chapter, label, page, lesson page or section summary.</w:t>
+      </w:r>
+    </w:p>
+    <w:p>
+      <w:pPr>
+        <w:keepNext/>
+        <w:pStyle w:val="ListParagraph"/>
         <w:numPr>
           <w:ilvl w:val="0"/>
-          <w:numId w:val="3"/>
+          <w:numId w:val="1"/>
         </w:numPr>
-      </w:pPr>
-      <w:r>
-        <w:t>Start the tag with {poll: and close it with }.</w:t>
-      </w:r>
-    </w:p>
-    <w:p>
-      <w:pPr>
-        <w:numPr>
-          <w:ilvl w:val="0"/>
-          <w:numId w:val="3"/>
-        </w:numPr>
-      </w:pPr>
-      <w:r>
-        <w:t>Each option must be wrapped in double quotes: "like this".</w:t>
-      </w:r>
-    </w:p>
-    <w:p>
-      <w:pPr>
-        <w:numPr>
-          <w:ilvl w:val="0"/>
-          <w:numId w:val="3"/>
-        </w:numPr>
-      </w:pPr>
-      <w:r>
-        <w:lastRenderedPageBreak/>
-        <w:t>Separate options with a comma: ,.</w:t>
-      </w:r>
-    </w:p>
-    <w:p>
-      <w:pPr>
-        <w:numPr>
-          <w:ilvl w:val="0"/>
-          <w:numId w:val="3"/>
-        </w:numPr>
-      </w:pPr>
-      <w:r>
-        <w:t xml:space="preserve">You can include </w:t>
+        <w:rPr>
+          <w:lang w:val="en-NZ"/>
+        </w:rPr>
+      </w:pPr>
+      <w:r>
+        <w:rPr>
+          <w:lang w:val="en-NZ"/>
+        </w:rPr>
+        <w:t xml:space="preserve">Place the cursor where the poll should go, then select the </w:t>
       </w:r>
       <w:r>
         <w:rPr>
           <w:b/>
           <w:bCs/>
-        </w:rPr>
-        <w:t>two or more</w:t>
-      </w:r>
-      <w:r>
-        <w:t xml:space="preserve"> options. There is no fixed maximum</w:t>
-      </w:r>
-      <w:r>
-        <w:t xml:space="preserve">. </w:t>
-      </w:r>
-      <w:r>
-        <w:t>Less than 7 is advised</w:t>
-      </w:r>
-      <w:r>
-        <w:t>.</w:t>
-      </w:r>
-    </w:p>
-    <w:p>
-      <w:pPr>
-        <w:numPr>
-          <w:ilvl w:val="0"/>
-          <w:numId w:val="3"/>
-        </w:numPr>
-      </w:pPr>
-      <w:r>
-        <w:t>Options appear in the order you write them.</w:t>
-      </w:r>
-    </w:p>
-    <w:p>
-      <w:pPr>
-        <w:pStyle w:val="Heading2"/>
-      </w:pPr>
-      <w:r>
-        <w:t>Examples</w:t>
-      </w:r>
-    </w:p>
-    <w:p>
-      <w:r>
-        <w:t>A simple yes/no poll:</w:t>
-      </w:r>
-    </w:p>
-    <w:p>
-      <w:r>
-        <w:t>{poll:"Yes","No"}</w:t>
-      </w:r>
-    </w:p>
-    <w:p>
-      <w:r>
-        <w:t>A rating scale:</w:t>
-      </w:r>
-    </w:p>
-    <w:p>
-      <w:r>
-        <w:t>{poll:"Poor","Fair","Good","Very Good","Excellent"}</w:t>
-      </w:r>
-    </w:p>
-    <w:p>
-      <w:r>
-        <w:t>A poll using emoji:</w:t>
-      </w:r>
-    </w:p>
-    <w:p>
-      <w:r>
-        <w:t>{poll:"</w:t>
-      </w:r>
-      <w:r>
-        <w:rPr>
-          <w:rFonts w:ascii="Segoe UI Emoji" w:hAnsi="Segoe UI Emoji" w:cs="Segoe UI Emoji"/>
-        </w:rPr>
-        <w:t>😍</w:t>
-      </w:r>
-      <w:r>
-        <w:t>","</w:t>
-      </w:r>
-      <w:r>
-        <w:rPr>
-          <w:rFonts w:ascii="Segoe UI Emoji" w:hAnsi="Segoe UI Emoji" w:cs="Segoe UI Emoji"/>
-        </w:rPr>
-        <w:t>🙂</w:t>
-      </w:r>
-      <w:r>
-        <w:t>","</w:t>
-      </w:r>
-      <w:r>
-        <w:rPr>
-          <w:rFonts w:ascii="Segoe UI Emoji" w:hAnsi="Segoe UI Emoji" w:cs="Segoe UI Emoji"/>
-        </w:rPr>
-        <w:t>😐</w:t>
-      </w:r>
-      <w:r>
-        <w:t>","</w:t>
-      </w:r>
-      <w:r>
-        <w:rPr>
-          <w:rFonts w:ascii="Segoe UI Emoji" w:hAnsi="Segoe UI Emoji" w:cs="Segoe UI Emoji"/>
-        </w:rPr>
-        <w:t>🙁</w:t>
-      </w:r>
-      <w:r>
-        <w:t>","</w:t>
-      </w:r>
-      <w:r>
-        <w:rPr>
-          <w:rFonts w:ascii="Segoe UI Emoji" w:hAnsi="Segoe UI Emoji" w:cs="Segoe UI Emoji"/>
-        </w:rPr>
-        <w:t>😠</w:t>
-      </w:r>
-      <w:r>
-        <w:t>"}</w:t>
-      </w:r>
-    </w:p>
-    <w:p>
-      <w:pPr>
-        <w:pStyle w:val="Heading2"/>
-      </w:pPr>
-      <w:r>
-        <w:t>Tips</w:t>
-      </w:r>
-    </w:p>
-    <w:p>
-      <w:pPr>
-        <w:numPr>
-          <w:ilvl w:val="0"/>
-          <w:numId w:val="4"/>
-        </w:numPr>
-      </w:pPr>
-      <w:r>
-        <w:t>Keep option labels short so they're easy to read.</w:t>
-      </w:r>
-    </w:p>
-    <w:p>
-      <w:pPr>
-        <w:numPr>
-          <w:ilvl w:val="0"/>
-          <w:numId w:val="4"/>
-        </w:numPr>
-      </w:pPr>
-      <w:r>
-        <w:t>Put the options in a logical order (e.g. lowest to highest).</w:t>
-      </w:r>
-    </w:p>
-    <w:p>
-      <w:pPr>
-        <w:numPr>
-          <w:ilvl w:val="0"/>
-          <w:numId w:val="4"/>
-        </w:numPr>
-      </w:pPr>
-      <w:r>
-        <w:t xml:space="preserve">Avoid duplicate options </w:t>
-      </w:r>
-      <w:r>
-        <w:t>-</w:t>
-      </w:r>
-      <w:r>
-        <w:t xml:space="preserve"> each choice should be distinct.</w:t>
-      </w:r>
-    </w:p>
-    <w:p>
-      <w:pPr>
-        <w:pStyle w:val="Heading1"/>
-        <w:rPr>
-          <w:lang w:val="en-NZ"/>
-        </w:rPr>
-      </w:pPr>
-      <w:r>
-        <w:rPr>
-          <w:lang w:val="en-NZ"/>
-        </w:rPr>
-        <w:lastRenderedPageBreak/>
-        <w:t>Teacher view</w:t>
-      </w:r>
-      <w:bookmarkEnd w:id="2"/>
+          <w:lang w:val="en-NZ"/>
+        </w:rPr>
+        <w:t xml:space="preserve">Poll</w:t>
+      </w:r>
+      <w:r>
+        <w:rPr>
+          <w:lang w:val="en-NZ"/>
+        </w:rPr>
+        <w:t xml:space="preserve"> button on the toolbar (also under </w:t>
+      </w:r>
+      <w:r>
+        <w:rPr>
+          <w:b/>
+          <w:bCs/>
+          <w:lang w:val="en-NZ"/>
+        </w:rPr>
+        <w:t xml:space="preserve">Insert</w:t>
+      </w:r>
+      <w:r>
+        <w:rPr>
+          <w:lang w:val="en-NZ"/>
+        </w:rPr>
+        <w:t xml:space="preserve">).</w:t>
+      </w:r>
     </w:p>
     <w:p>
       <w:pPr>
@@ -1109,10 +1103,10 @@
           <w:lang w:val="en-NZ"/>
         </w:rPr>
         <w:drawing>
-          <wp:inline distT="0" distB="0" distL="0" distR="0" wp14:anchorId="02BBBB84" wp14:editId="3AE15AAC">
-            <wp:extent cx="4284000" cy="4150800"/>
-            <wp:effectExtent l="0" t="0" r="2540" b="2540"/>
-            <wp:docPr id="1445963462" name="Picture 1"/>
+          <wp:inline distT="0" distB="0" distL="0" distR="0">
+            <wp:extent cx="5652000" cy="1689631"/>
+            <wp:effectExtent l="0" t="0" r="0" b="0"/>
+            <wp:docPr id="2001" name="Picture 2001"/>
             <wp:cNvGraphicFramePr>
               <a:graphicFrameLocks xmlns:a="http://schemas.openxmlformats.org/drawingml/2006/main" noChangeAspect="1"/>
             </wp:cNvGraphicFramePr>
@@ -1120,11 +1114,11 @@
               <a:graphicData uri="http://schemas.openxmlformats.org/drawingml/2006/picture">
                 <pic:pic xmlns:pic="http://schemas.openxmlformats.org/drawingml/2006/picture">
                   <pic:nvPicPr>
-                    <pic:cNvPr id="1445963462" name=""/>
+                    <pic:cNvPr id="2001" name="poll-10-editor-button.png"/>
                     <pic:cNvPicPr/>
                   </pic:nvPicPr>
                   <pic:blipFill>
-                    <a:blip r:embed="rId6"/>
+                    <a:blip r:embed="rId101"/>
                     <a:stretch>
                       <a:fillRect/>
                     </a:stretch>
@@ -1132,7 +1126,7 @@
                   <pic:spPr>
                     <a:xfrm>
                       <a:off x="0" y="0"/>
-                      <a:ext cx="4284000" cy="4150800"/>
+                      <a:ext cx="5652000" cy="1689631"/>
                     </a:xfrm>
                     <a:prstGeom prst="rect">
                       <a:avLst/>
@@ -1147,39 +1141,36 @@
     </w:p>
     <w:p>
       <w:pPr>
-        <w:rPr>
-          <w:lang w:val="en-NZ"/>
-        </w:rPr>
-      </w:pPr>
-      <w:r>
-        <w:rPr>
-          <w:lang w:val="en-NZ"/>
-        </w:rPr>
-        <w:t>Teachers always see</w:t>
-      </w:r>
-      <w:r>
-        <w:rPr>
-          <w:lang w:val="en-NZ"/>
-        </w:rPr>
-        <w:t xml:space="preserve"> results and, by default, cannot vote.</w:t>
-      </w:r>
-    </w:p>
-    <w:p>
-      <w:pPr>
-        <w:pStyle w:val="Heading1"/>
-        <w:rPr>
-          <w:lang w:val="en-NZ"/>
-        </w:rPr>
-      </w:pPr>
-      <w:bookmarkStart w:id="3" w:name="_Toc233545421"/>
-      <w:r>
-        <w:rPr>
-          <w:lang w:val="en-NZ"/>
-        </w:rPr>
-        <w:lastRenderedPageBreak/>
-        <w:t>Student view</w:t>
-      </w:r>
-      <w:bookmarkEnd w:id="3"/>
+        <w:keepNext/>
+        <w:pStyle w:val="ListParagraph"/>
+        <w:numPr>
+          <w:ilvl w:val="0"/>
+          <w:numId w:val="1"/>
+        </w:numPr>
+        <w:rPr>
+          <w:lang w:val="en-NZ"/>
+        </w:rPr>
+      </w:pPr>
+      <w:r>
+        <w:rPr>
+          <w:lang w:val="en-NZ"/>
+        </w:rPr>
+        <w:t xml:space="preserve">Enter the options, one per line, in the order they should appear, then select </w:t>
+      </w:r>
+      <w:r>
+        <w:rPr>
+          <w:b/>
+          <w:bCs/>
+          <w:lang w:val="en-NZ"/>
+        </w:rPr>
+        <w:t xml:space="preserve">Save changes</w:t>
+      </w:r>
+      <w:r>
+        <w:rPr>
+          <w:lang w:val="en-NZ"/>
+        </w:rPr>
+        <w:t xml:space="preserve">.</w:t>
+      </w:r>
     </w:p>
     <w:p>
       <w:pPr>
@@ -1193,10 +1184,10 @@
           <w:lang w:val="en-NZ"/>
         </w:rPr>
         <w:drawing>
-          <wp:inline distT="0" distB="0" distL="0" distR="0" wp14:anchorId="669B4F45" wp14:editId="726059BD">
-            <wp:extent cx="4435200" cy="3855600"/>
-            <wp:effectExtent l="0" t="0" r="3810" b="0"/>
-            <wp:docPr id="887543305" name="Picture 1"/>
+          <wp:inline distT="0" distB="0" distL="0" distR="0">
+            <wp:extent cx="5580000" cy="3038000"/>
+            <wp:effectExtent l="0" t="0" r="0" b="0"/>
+            <wp:docPr id="2002" name="Picture 2002"/>
             <wp:cNvGraphicFramePr>
               <a:graphicFrameLocks xmlns:a="http://schemas.openxmlformats.org/drawingml/2006/main" noChangeAspect="1"/>
             </wp:cNvGraphicFramePr>
@@ -1204,11 +1195,11 @@
               <a:graphicData uri="http://schemas.openxmlformats.org/drawingml/2006/picture">
                 <pic:pic xmlns:pic="http://schemas.openxmlformats.org/drawingml/2006/picture">
                   <pic:nvPicPr>
-                    <pic:cNvPr id="887543305" name=""/>
+                    <pic:cNvPr id="2002" name="poll-11-form-new.png"/>
                     <pic:cNvPicPr/>
                   </pic:nvPicPr>
                   <pic:blipFill>
-                    <a:blip r:embed="rId7"/>
+                    <a:blip r:embed="rId102"/>
                     <a:stretch>
                       <a:fillRect/>
                     </a:stretch>
@@ -1216,7 +1207,7 @@
                   <pic:spPr>
                     <a:xfrm>
                       <a:off x="0" y="0"/>
-                      <a:ext cx="4435200" cy="3855600"/>
+                      <a:ext cx="5580000" cy="3038000"/>
                     </a:xfrm>
                     <a:prstGeom prst="rect">
                       <a:avLst/>
@@ -1231,15 +1222,21 @@
     </w:p>
     <w:p>
       <w:pPr>
-        <w:rPr>
-          <w:lang w:val="en-NZ"/>
-        </w:rPr>
-      </w:pPr>
-      <w:r>
-        <w:rPr>
-          <w:lang w:val="en-NZ"/>
-        </w:rPr>
-        <w:t>Students must select an option before seeing the results.</w:t>
+        <w:keepNext/>
+        <w:pStyle w:val="ListParagraph"/>
+        <w:numPr>
+          <w:ilvl w:val="0"/>
+          <w:numId w:val="1"/>
+        </w:numPr>
+        <w:rPr>
+          <w:lang w:val="en-NZ"/>
+        </w:rPr>
+      </w:pPr>
+      <w:r>
+        <w:rPr>
+          <w:lang w:val="en-NZ"/>
+        </w:rPr>
+        <w:t xml:space="preserve">The poll appears in the editor as it will on the page, including the results you can see. It can’t be voted in from the editor. Save the page as usual.</w:t>
       </w:r>
     </w:p>
     <w:p>
@@ -1254,10 +1251,10 @@
           <w:lang w:val="en-NZ"/>
         </w:rPr>
         <w:drawing>
-          <wp:inline distT="0" distB="0" distL="0" distR="0" wp14:anchorId="34DDE722" wp14:editId="755F9F05">
-            <wp:extent cx="4431600" cy="2505600"/>
-            <wp:effectExtent l="0" t="0" r="7620" b="9525"/>
-            <wp:docPr id="147993804" name="Picture 1"/>
+          <wp:inline distT="0" distB="0" distL="0" distR="0">
+            <wp:extent cx="5652000" cy="2722694"/>
+            <wp:effectExtent l="0" t="0" r="0" b="0"/>
+            <wp:docPr id="2003" name="Picture 2003"/>
             <wp:cNvGraphicFramePr>
               <a:graphicFrameLocks xmlns:a="http://schemas.openxmlformats.org/drawingml/2006/main" noChangeAspect="1"/>
             </wp:cNvGraphicFramePr>
@@ -1265,11 +1262,11 @@
               <a:graphicData uri="http://schemas.openxmlformats.org/drawingml/2006/picture">
                 <pic:pic xmlns:pic="http://schemas.openxmlformats.org/drawingml/2006/picture">
                   <pic:nvPicPr>
-                    <pic:cNvPr id="147993804" name=""/>
+                    <pic:cNvPr id="2003" name="poll-12-editor-preview.png"/>
                     <pic:cNvPicPr/>
                   </pic:nvPicPr>
                   <pic:blipFill>
-                    <a:blip r:embed="rId8"/>
+                    <a:blip r:embed="rId103"/>
                     <a:stretch>
                       <a:fillRect/>
                     </a:stretch>
@@ -1277,7 +1274,7 @@
                   <pic:spPr>
                     <a:xfrm>
                       <a:off x="0" y="0"/>
-                      <a:ext cx="4431600" cy="2505600"/>
+                      <a:ext cx="5652000" cy="2722694"/>
                     </a:xfrm>
                     <a:prstGeom prst="rect">
                       <a:avLst/>
@@ -1292,6 +1289,123 @@
     </w:p>
     <w:p>
       <w:pPr>
+        <w:pStyle w:val="Heading2"/>
+        <w:rPr>
+          <w:lang w:val="en-NZ"/>
+        </w:rPr>
+      </w:pPr>
+      <w:bookmarkStart w:id="102" w:name="_Toc900000003"/>
+      <w:r>
+        <w:rPr>
+          <w:lang w:val="en-NZ"/>
+        </w:rPr>
+        <w:t xml:space="preserve">Rules</w:t>
+      </w:r>
+      <w:bookmarkEnd w:id="102"/>
+    </w:p>
+    <w:p>
+      <w:pPr>
+        <w:numPr>
+          <w:ilvl w:val="0"/>
+          <w:numId w:val="3"/>
+        </w:numPr>
+        <w:rPr>
+          <w:lang w:val="en-NZ"/>
+        </w:rPr>
+      </w:pPr>
+      <w:r>
+        <w:rPr>
+          <w:lang w:val="en-NZ"/>
+        </w:rPr>
+        <w:t xml:space="preserve">Enter each option on its own line.</w:t>
+      </w:r>
+    </w:p>
+    <w:p>
+      <w:pPr>
+        <w:numPr>
+          <w:ilvl w:val="0"/>
+          <w:numId w:val="3"/>
+        </w:numPr>
+        <w:rPr>
+          <w:lang w:val="en-NZ"/>
+        </w:rPr>
+      </w:pPr>
+      <w:r>
+        <w:rPr>
+          <w:lang w:val="en-NZ"/>
+        </w:rPr>
+        <w:t xml:space="preserve">You can include two or more options. There is no fixed maximum. Less than 7 is advised.</w:t>
+      </w:r>
+    </w:p>
+    <w:p>
+      <w:pPr>
+        <w:numPr>
+          <w:ilvl w:val="0"/>
+          <w:numId w:val="3"/>
+        </w:numPr>
+        <w:rPr>
+          <w:lang w:val="en-NZ"/>
+        </w:rPr>
+      </w:pPr>
+      <w:r>
+        <w:rPr>
+          <w:lang w:val="en-NZ"/>
+        </w:rPr>
+        <w:t xml:space="preserve">Options appear in the order you write them.</w:t>
+      </w:r>
+    </w:p>
+    <w:p>
+      <w:pPr>
+        <w:numPr>
+          <w:ilvl w:val="0"/>
+          <w:numId w:val="3"/>
+        </w:numPr>
+        <w:rPr>
+          <w:lang w:val="en-NZ"/>
+        </w:rPr>
+      </w:pPr>
+      <w:r>
+        <w:rPr>
+          <w:lang w:val="en-NZ"/>
+        </w:rPr>
+        <w:t xml:space="preserve">Each option must be different. Options that differ only in capitalisation (e.g. “Yes” and “yes”) count as the same.</w:t>
+      </w:r>
+    </w:p>
+    <w:p>
+      <w:pPr>
+        <w:numPr>
+          <w:ilvl w:val="0"/>
+          <w:numId w:val="3"/>
+        </w:numPr>
+        <w:rPr>
+          <w:lang w:val="en-NZ"/>
+        </w:rPr>
+      </w:pPr>
+      <w:r>
+        <w:rPr>
+          <w:lang w:val="en-NZ"/>
+        </w:rPr>
+        <w:t xml:space="preserve">Each option can be up to 255 characters long.</w:t>
+      </w:r>
+    </w:p>
+    <w:p>
+      <w:pPr>
+        <w:pStyle w:val="Heading2"/>
+        <w:rPr>
+          <w:lang w:val="en-NZ"/>
+        </w:rPr>
+      </w:pPr>
+      <w:bookmarkStart w:id="103" w:name="_Toc900000004"/>
+      <w:r>
+        <w:rPr>
+          <w:lang w:val="en-NZ"/>
+        </w:rPr>
+        <w:t xml:space="preserve">Examples</w:t>
+      </w:r>
+      <w:bookmarkEnd w:id="103"/>
+    </w:p>
+    <w:p>
+      <w:pPr>
         <w:keepNext/>
         <w:rPr>
           <w:lang w:val="en-NZ"/>
@@ -1301,8 +1415,277 @@
         <w:rPr>
           <w:lang w:val="en-NZ"/>
         </w:rPr>
-        <w:lastRenderedPageBreak/>
-        <w:t>Students can change their response.</w:t>
+        <w:t xml:space="preserve">A simple yes/no poll:</w:t>
+      </w:r>
+    </w:p>
+    <w:p>
+      <w:pPr>
+        <w:keepLines/>
+        <w:ind w:left="567"/>
+        <w:rPr>
+          <w:lang w:val="en-NZ"/>
+        </w:rPr>
+      </w:pPr>
+      <w:r>
+        <w:rPr>
+          <w:lang w:val="en-NZ"/>
+        </w:rPr>
+        <w:t xml:space="preserve">Yes</w:t>
+      </w:r>
+      <w:r>
+        <w:br/>
+      </w:r>
+      <w:r>
+        <w:rPr>
+          <w:lang w:val="en-NZ"/>
+        </w:rPr>
+        <w:t xml:space="preserve">No</w:t>
+      </w:r>
+    </w:p>
+    <w:p>
+      <w:pPr>
+        <w:keepNext/>
+        <w:rPr>
+          <w:lang w:val="en-NZ"/>
+        </w:rPr>
+      </w:pPr>
+      <w:r>
+        <w:rPr>
+          <w:lang w:val="en-NZ"/>
+        </w:rPr>
+        <w:t xml:space="preserve">A rating scale:</w:t>
+      </w:r>
+    </w:p>
+    <w:p>
+      <w:pPr>
+        <w:keepLines/>
+        <w:ind w:left="567"/>
+        <w:rPr>
+          <w:lang w:val="en-NZ"/>
+        </w:rPr>
+      </w:pPr>
+      <w:r>
+        <w:rPr>
+          <w:lang w:val="en-NZ"/>
+        </w:rPr>
+        <w:t xml:space="preserve">Poor</w:t>
+      </w:r>
+      <w:r>
+        <w:br/>
+      </w:r>
+      <w:r>
+        <w:rPr>
+          <w:lang w:val="en-NZ"/>
+        </w:rPr>
+        <w:t xml:space="preserve">Fair</w:t>
+      </w:r>
+      <w:r>
+        <w:br/>
+      </w:r>
+      <w:r>
+        <w:rPr>
+          <w:lang w:val="en-NZ"/>
+        </w:rPr>
+        <w:t xml:space="preserve">Good</w:t>
+      </w:r>
+      <w:r>
+        <w:br/>
+      </w:r>
+      <w:r>
+        <w:rPr>
+          <w:lang w:val="en-NZ"/>
+        </w:rPr>
+        <w:t xml:space="preserve">Very Good</w:t>
+      </w:r>
+      <w:r>
+        <w:br/>
+      </w:r>
+      <w:r>
+        <w:rPr>
+          <w:lang w:val="en-NZ"/>
+        </w:rPr>
+        <w:t xml:space="preserve">Excellent</w:t>
+      </w:r>
+    </w:p>
+    <w:p>
+      <w:pPr>
+        <w:keepNext/>
+        <w:rPr>
+          <w:lang w:val="en-NZ"/>
+        </w:rPr>
+      </w:pPr>
+      <w:r>
+        <w:rPr>
+          <w:lang w:val="en-NZ"/>
+        </w:rPr>
+        <w:t xml:space="preserve">A poll using emoji:</w:t>
+      </w:r>
+    </w:p>
+    <w:p>
+      <w:pPr>
+        <w:keepLines/>
+        <w:ind w:left="567"/>
+        <w:rPr>
+          <w:lang w:val="en-NZ"/>
+        </w:rPr>
+      </w:pPr>
+      <w:r>
+        <w:rPr>
+          <w:rFonts w:ascii="Segoe UI Emoji" w:hAnsi="Segoe UI Emoji" w:cs="Segoe UI Emoji"/>
+          <w:lang w:val="en-NZ"/>
+        </w:rPr>
+        <w:t xml:space="preserve">😍</w:t>
+      </w:r>
+      <w:r>
+        <w:br/>
+      </w:r>
+      <w:r>
+        <w:rPr>
+          <w:rFonts w:ascii="Segoe UI Emoji" w:hAnsi="Segoe UI Emoji" w:cs="Segoe UI Emoji"/>
+          <w:lang w:val="en-NZ"/>
+        </w:rPr>
+        <w:t xml:space="preserve">🙂</w:t>
+      </w:r>
+      <w:r>
+        <w:br/>
+      </w:r>
+      <w:r>
+        <w:rPr>
+          <w:rFonts w:ascii="Segoe UI Emoji" w:hAnsi="Segoe UI Emoji" w:cs="Segoe UI Emoji"/>
+          <w:lang w:val="en-NZ"/>
+        </w:rPr>
+        <w:t xml:space="preserve">😐</w:t>
+      </w:r>
+      <w:r>
+        <w:br/>
+      </w:r>
+      <w:r>
+        <w:rPr>
+          <w:rFonts w:ascii="Segoe UI Emoji" w:hAnsi="Segoe UI Emoji" w:cs="Segoe UI Emoji"/>
+          <w:lang w:val="en-NZ"/>
+        </w:rPr>
+        <w:t xml:space="preserve">🙁</w:t>
+      </w:r>
+      <w:r>
+        <w:br/>
+      </w:r>
+      <w:r>
+        <w:rPr>
+          <w:rFonts w:ascii="Segoe UI Emoji" w:hAnsi="Segoe UI Emoji" w:cs="Segoe UI Emoji"/>
+          <w:lang w:val="en-NZ"/>
+        </w:rPr>
+        <w:t xml:space="preserve">😠</w:t>
+      </w:r>
+    </w:p>
+    <w:p>
+      <w:pPr>
+        <w:pStyle w:val="Heading2"/>
+        <w:rPr>
+          <w:lang w:val="en-NZ"/>
+        </w:rPr>
+      </w:pPr>
+      <w:bookmarkStart w:id="104" w:name="_Toc900000005"/>
+      <w:r>
+        <w:rPr>
+          <w:lang w:val="en-NZ"/>
+        </w:rPr>
+        <w:t xml:space="preserve">Tips</w:t>
+      </w:r>
+      <w:bookmarkEnd w:id="104"/>
+    </w:p>
+    <w:p>
+      <w:pPr>
+        <w:numPr>
+          <w:ilvl w:val="0"/>
+          <w:numId w:val="3"/>
+        </w:numPr>
+        <w:rPr>
+          <w:lang w:val="en-NZ"/>
+        </w:rPr>
+      </w:pPr>
+      <w:r>
+        <w:rPr>
+          <w:lang w:val="en-NZ"/>
+        </w:rPr>
+        <w:t xml:space="preserve">Keep option labels short so they're easy to read.</w:t>
+      </w:r>
+    </w:p>
+    <w:p>
+      <w:pPr>
+        <w:numPr>
+          <w:ilvl w:val="0"/>
+          <w:numId w:val="3"/>
+        </w:numPr>
+        <w:rPr>
+          <w:lang w:val="en-NZ"/>
+        </w:rPr>
+      </w:pPr>
+      <w:r>
+        <w:rPr>
+          <w:lang w:val="en-NZ"/>
+        </w:rPr>
+        <w:t xml:space="preserve">Put the options in a logical order (e.g. lowest to highest).</w:t>
+      </w:r>
+    </w:p>
+    <w:p>
+      <w:pPr>
+        <w:numPr>
+          <w:ilvl w:val="0"/>
+          <w:numId w:val="3"/>
+        </w:numPr>
+        <w:rPr>
+          <w:lang w:val="en-NZ"/>
+        </w:rPr>
+      </w:pPr>
+      <w:r>
+        <w:rPr>
+          <w:lang w:val="en-NZ"/>
+        </w:rPr>
+        <w:t xml:space="preserve">Avoid near-duplicate options - each choice should be distinct.</w:t>
+      </w:r>
+    </w:p>
+    <w:p>
+      <w:pPr>
+        <w:pStyle w:val="Heading1"/>
+        <w:rPr>
+          <w:lang w:val="en-NZ"/>
+        </w:rPr>
+      </w:pPr>
+      <w:bookmarkStart w:id="105" w:name="_Toc900000006"/>
+      <w:r>
+        <w:rPr>
+          <w:lang w:val="en-NZ"/>
+        </w:rPr>
+        <w:t xml:space="preserve">Editing, moving and deleting a poll</w:t>
+      </w:r>
+      <w:bookmarkEnd w:id="105"/>
+    </w:p>
+    <w:p>
+      <w:pPr>
+        <w:keepNext/>
+        <w:rPr>
+          <w:lang w:val="en-NZ"/>
+        </w:rPr>
+      </w:pPr>
+      <w:r>
+        <w:rPr>
+          <w:lang w:val="en-NZ"/>
+        </w:rPr>
+        <w:t xml:space="preserve">To edit a poll, click it in the editor. When you point at a poll, </w:t>
+      </w:r>
+      <w:r>
+        <w:rPr>
+          <w:b/>
+          <w:bCs/>
+          <w:lang w:val="en-NZ"/>
+        </w:rPr>
+        <w:t xml:space="preserve">Click to edit</w:t>
+      </w:r>
+      <w:r>
+        <w:rPr>
+          <w:lang w:val="en-NZ"/>
+        </w:rPr>
+        <w:t xml:space="preserve"> appears at its top right, and up and down arrows appear at its bottom right.</w:t>
       </w:r>
     </w:p>
     <w:p>
@@ -1317,10 +1700,10 @@
           <w:lang w:val="en-NZ"/>
         </w:rPr>
         <w:drawing>
-          <wp:inline distT="0" distB="0" distL="0" distR="0" wp14:anchorId="32CE4A7F" wp14:editId="70646A4A">
-            <wp:extent cx="4438800" cy="2318400"/>
-            <wp:effectExtent l="0" t="0" r="0" b="5715"/>
-            <wp:docPr id="1656588327" name="Picture 1"/>
+          <wp:inline distT="0" distB="0" distL="0" distR="0">
+            <wp:extent cx="5652000" cy="2722694"/>
+            <wp:effectExtent l="0" t="0" r="0" b="0"/>
+            <wp:docPr id="2004" name="Picture 2004"/>
             <wp:cNvGraphicFramePr>
               <a:graphicFrameLocks xmlns:a="http://schemas.openxmlformats.org/drawingml/2006/main" noChangeAspect="1"/>
             </wp:cNvGraphicFramePr>
@@ -1328,11 +1711,11 @@
               <a:graphicData uri="http://schemas.openxmlformats.org/drawingml/2006/picture">
                 <pic:pic xmlns:pic="http://schemas.openxmlformats.org/drawingml/2006/picture">
                   <pic:nvPicPr>
-                    <pic:cNvPr id="1656588327" name=""/>
+                    <pic:cNvPr id="2004" name="poll-13-editor-hover.png"/>
                     <pic:cNvPicPr/>
                   </pic:nvPicPr>
                   <pic:blipFill>
-                    <a:blip r:embed="rId9"/>
+                    <a:blip r:embed="rId104"/>
                     <a:stretch>
                       <a:fillRect/>
                     </a:stretch>
@@ -1340,7 +1723,7 @@
                   <pic:spPr>
                     <a:xfrm>
                       <a:off x="0" y="0"/>
-                      <a:ext cx="4438800" cy="2318400"/>
+                      <a:ext cx="5652000" cy="2722694"/>
                     </a:xfrm>
                     <a:prstGeom prst="rect">
                       <a:avLst/>
@@ -1355,19 +1738,98 @@
     </w:p>
     <w:p>
       <w:pPr>
-        <w:pStyle w:val="Heading1"/>
-        <w:rPr>
-          <w:lang w:val="en-NZ"/>
-        </w:rPr>
-      </w:pPr>
-      <w:bookmarkStart w:id="4" w:name="_Toc233545422"/>
-      <w:r>
-        <w:rPr>
-          <w:lang w:val="en-NZ"/>
-        </w:rPr>
-        <w:t>Multiple polls</w:t>
-      </w:r>
-      <w:bookmarkEnd w:id="4"/>
+        <w:numPr>
+          <w:ilvl w:val="0"/>
+          <w:numId w:val="3"/>
+        </w:numPr>
+        <w:rPr>
+          <w:lang w:val="en-NZ"/>
+        </w:rPr>
+      </w:pPr>
+      <w:r>
+        <w:rPr>
+          <w:lang w:val="en-NZ"/>
+        </w:rPr>
+        <w:t xml:space="preserve">Use the up and down arrows to move the poll past the paragraph (or other block) before or after it.</w:t>
+      </w:r>
+    </w:p>
+    <w:p>
+      <w:pPr>
+        <w:numPr>
+          <w:ilvl w:val="0"/>
+          <w:numId w:val="3"/>
+        </w:numPr>
+        <w:rPr>
+          <w:lang w:val="en-NZ"/>
+        </w:rPr>
+      </w:pPr>
+      <w:r>
+        <w:rPr>
+          <w:lang w:val="en-NZ"/>
+        </w:rPr>
+        <w:t xml:space="preserve">To delete a poll, select </w:t>
+      </w:r>
+      <w:r>
+        <w:rPr>
+          <w:b/>
+          <w:bCs/>
+          <w:lang w:val="en-NZ"/>
+        </w:rPr>
+        <w:t xml:space="preserve">Delete</w:t>
+      </w:r>
+      <w:r>
+        <w:rPr>
+          <w:lang w:val="en-NZ"/>
+        </w:rPr>
+        <w:t xml:space="preserve"> in its form, or delete it as you would any other content. Until you save the page, </w:t>
+      </w:r>
+      <w:r>
+        <w:rPr>
+          <w:b/>
+          <w:bCs/>
+          <w:lang w:val="en-NZ"/>
+        </w:rPr>
+        <w:t xml:space="preserve">Undo</w:t>
+      </w:r>
+      <w:r>
+        <w:rPr>
+          <w:lang w:val="en-NZ"/>
+        </w:rPr>
+        <w:t xml:space="preserve"> brings it back.</w:t>
+      </w:r>
+    </w:p>
+    <w:p>
+      <w:pPr>
+        <w:numPr>
+          <w:ilvl w:val="0"/>
+          <w:numId w:val="3"/>
+        </w:numPr>
+        <w:rPr>
+          <w:lang w:val="en-NZ"/>
+        </w:rPr>
+      </w:pPr>
+      <w:r>
+        <w:rPr>
+          <w:lang w:val="en-NZ"/>
+        </w:rPr>
+        <w:t xml:space="preserve">Teachers who can’t edit polls (by default, non-editing teachers) still see polls in the editor, but can’t edit, move or delete them.</w:t>
+      </w:r>
+    </w:p>
+    <w:p>
+      <w:pPr>
+        <w:pStyle w:val="Heading2"/>
+        <w:rPr>
+          <w:lang w:val="en-NZ"/>
+        </w:rPr>
+      </w:pPr>
+      <w:bookmarkStart w:id="106" w:name="_Toc900000007"/>
+      <w:r>
+        <w:rPr>
+          <w:lang w:val="en-NZ"/>
+        </w:rPr>
+        <w:t xml:space="preserve">Editing a poll that has votes</w:t>
+      </w:r>
+      <w:bookmarkEnd w:id="106"/>
     </w:p>
     <w:p>
       <w:pPr>
@@ -1380,13 +1842,7 @@
         <w:rPr>
           <w:lang w:val="en-NZ"/>
         </w:rPr>
-        <w:t>There can be multiple polls within a book chapter or label</w:t>
-      </w:r>
-      <w:r>
-        <w:rPr>
-          <w:lang w:val="en-NZ"/>
-        </w:rPr>
-        <w:t>, e.g.:</w:t>
+        <w:t xml:space="preserve">If the poll already has votes, the form says so:</w:t>
       </w:r>
     </w:p>
     <w:p>
@@ -1401,10 +1857,10 @@
           <w:lang w:val="en-NZ"/>
         </w:rPr>
         <w:drawing>
-          <wp:inline distT="0" distB="0" distL="0" distR="0" wp14:anchorId="0247493B" wp14:editId="574E933D">
-            <wp:extent cx="4233600" cy="4618800"/>
+          <wp:inline distT="0" distB="0" distL="0" distR="0">
+            <wp:extent cx="5580000" cy="3651800"/>
             <wp:effectExtent l="0" t="0" r="0" b="0"/>
-            <wp:docPr id="19549881" name="Picture 1"/>
+            <wp:docPr id="2005" name="Picture 2005"/>
             <wp:cNvGraphicFramePr>
               <a:graphicFrameLocks xmlns:a="http://schemas.openxmlformats.org/drawingml/2006/main" noChangeAspect="1"/>
             </wp:cNvGraphicFramePr>
@@ -1412,11 +1868,11 @@
               <a:graphicData uri="http://schemas.openxmlformats.org/drawingml/2006/picture">
                 <pic:pic xmlns:pic="http://schemas.openxmlformats.org/drawingml/2006/picture">
                   <pic:nvPicPr>
-                    <pic:cNvPr id="19549881" name=""/>
+                    <pic:cNvPr id="2005" name="poll-14-form-votes.png"/>
                     <pic:cNvPicPr/>
                   </pic:nvPicPr>
                   <pic:blipFill>
-                    <a:blip r:embed="rId10"/>
+                    <a:blip r:embed="rId105"/>
                     <a:stretch>
                       <a:fillRect/>
                     </a:stretch>
@@ -1424,7 +1880,7 @@
                   <pic:spPr>
                     <a:xfrm>
                       <a:off x="0" y="0"/>
-                      <a:ext cx="4233600" cy="4618800"/>
+                      <a:ext cx="5580000" cy="3651800"/>
                     </a:xfrm>
                     <a:prstGeom prst="rect">
                       <a:avLst/>
@@ -1439,33 +1895,57 @@
     </w:p>
     <w:p>
       <w:pPr>
+        <w:numPr>
+          <w:ilvl w:val="0"/>
+          <w:numId w:val="3"/>
+        </w:numPr>
+        <w:rPr>
+          <w:lang w:val="en-NZ"/>
+        </w:rPr>
+      </w:pPr>
+      <w:r>
+        <w:rPr>
+          <w:lang w:val="en-NZ"/>
+        </w:rPr>
+        <w:t xml:space="preserve">Options you leave unchanged keep their votes, even if you reorder them or add new options.</w:t>
+      </w:r>
+    </w:p>
+    <w:p>
+      <w:pPr>
+        <w:numPr>
+          <w:ilvl w:val="0"/>
+          <w:numId w:val="3"/>
+        </w:numPr>
+        <w:rPr>
+          <w:lang w:val="en-NZ"/>
+        </w:rPr>
+      </w:pPr>
+      <w:r>
+        <w:rPr>
+          <w:lang w:val="en-NZ"/>
+        </w:rPr>
+        <w:t xml:space="preserve">Rewording or removing an option discards the votes cast for it. Students who chose it can vote again.</w:t>
+      </w:r>
+    </w:p>
+    <w:p>
+      <w:pPr>
+        <w:pStyle w:val="Heading1"/>
+        <w:rPr>
+          <w:lang w:val="en-NZ"/>
+        </w:rPr>
+      </w:pPr>
+      <w:bookmarkStart w:id="107" w:name="_Toc900000008"/>
+      <w:r>
+        <w:rPr>
+          <w:lang w:val="en-NZ"/>
+        </w:rPr>
+        <w:t xml:space="preserve">Teacher view</w:t>
+      </w:r>
+      <w:bookmarkEnd w:id="107"/>
+    </w:p>
+    <w:p>
+      <w:pPr>
         <w:keepNext/>
-        <w:rPr>
-          <w:lang w:val="en-NZ"/>
-        </w:rPr>
-      </w:pPr>
-      <w:r>
-        <w:rPr>
-          <w:lang w:val="en-NZ"/>
-        </w:rPr>
-        <w:lastRenderedPageBreak/>
-        <w:t>You can have multiple polls with the same options</w:t>
-      </w:r>
-      <w:r>
-        <w:rPr>
-          <w:lang w:val="en-NZ"/>
-        </w:rPr>
-        <w:t>,</w:t>
-      </w:r>
-      <w:r>
-        <w:rPr>
-          <w:lang w:val="en-NZ"/>
-        </w:rPr>
-        <w:t xml:space="preserve"> e.g.:</w:t>
-      </w:r>
-    </w:p>
-    <w:p>
-      <w:pPr>
         <w:jc w:val="center"/>
         <w:rPr>
           <w:lang w:val="en-NZ"/>
@@ -1473,13 +1953,13 @@
       </w:pPr>
       <w:r>
         <w:rPr>
-          <w:noProof/>
+          <w:lang w:val="en-NZ"/>
         </w:rPr>
         <w:drawing>
-          <wp:inline distT="0" distB="0" distL="0" distR="0" wp14:anchorId="2FFC3225" wp14:editId="7C737CD3">
-            <wp:extent cx="4230000" cy="4874400"/>
-            <wp:effectExtent l="0" t="0" r="0" b="2540"/>
-            <wp:docPr id="121429159" name="Picture 1"/>
+          <wp:inline distT="0" distB="0" distL="0" distR="0">
+            <wp:extent cx="5652000" cy="4006253"/>
+            <wp:effectExtent l="0" t="0" r="0" b="0"/>
+            <wp:docPr id="2006" name="Picture 2006"/>
             <wp:cNvGraphicFramePr>
               <a:graphicFrameLocks xmlns:a="http://schemas.openxmlformats.org/drawingml/2006/main" noChangeAspect="1"/>
             </wp:cNvGraphicFramePr>
@@ -1487,11 +1967,11 @@
               <a:graphicData uri="http://schemas.openxmlformats.org/drawingml/2006/picture">
                 <pic:pic xmlns:pic="http://schemas.openxmlformats.org/drawingml/2006/picture">
                   <pic:nvPicPr>
-                    <pic:cNvPr id="121429159" name=""/>
+                    <pic:cNvPr id="2006" name="poll-01-teacher-view.png"/>
                     <pic:cNvPicPr/>
                   </pic:nvPicPr>
                   <pic:blipFill>
-                    <a:blip r:embed="rId11"/>
+                    <a:blip r:embed="rId106"/>
                     <a:stretch>
                       <a:fillRect/>
                     </a:stretch>
@@ -1499,7 +1979,7 @@
                   <pic:spPr>
                     <a:xfrm>
                       <a:off x="0" y="0"/>
-                      <a:ext cx="4230000" cy="4874400"/>
+                      <a:ext cx="5652000" cy="4006253"/>
                     </a:xfrm>
                     <a:prstGeom prst="rect">
                       <a:avLst/>
@@ -1514,64 +1994,32 @@
     </w:p>
     <w:p>
       <w:pPr>
+        <w:rPr>
+          <w:lang w:val="en-NZ"/>
+        </w:rPr>
+      </w:pPr>
+      <w:r>
+        <w:rPr>
+          <w:lang w:val="en-NZ"/>
+        </w:rPr>
+        <w:t xml:space="preserve">Teachers always see results and, by default, cannot vote.</w:t>
+      </w:r>
+    </w:p>
+    <w:p>
+      <w:pPr>
         <w:pStyle w:val="Heading1"/>
         <w:rPr>
           <w:lang w:val="en-NZ"/>
         </w:rPr>
       </w:pPr>
-      <w:bookmarkStart w:id="5" w:name="_Toc233545423"/>
-      <w:r>
-        <w:rPr>
-          <w:lang w:val="en-NZ"/>
-        </w:rPr>
-        <w:lastRenderedPageBreak/>
-        <w:t>Compatible with C4L components</w:t>
-      </w:r>
-      <w:bookmarkEnd w:id="5"/>
-    </w:p>
-    <w:p>
-      <w:pPr>
-        <w:keepNext/>
-        <w:rPr>
-          <w:lang w:val="en-NZ"/>
-        </w:rPr>
-      </w:pPr>
-      <w:r>
-        <w:rPr>
-          <w:lang w:val="en-NZ"/>
-        </w:rPr>
-        <w:t xml:space="preserve">Embedded polls can sit inside most </w:t>
-      </w:r>
-      <w:r>
-        <w:rPr>
-          <w:lang w:val="en-NZ"/>
-        </w:rPr>
-        <w:t>C4L</w:t>
-      </w:r>
-      <w:r>
-        <w:rPr>
-          <w:lang w:val="en-NZ"/>
-        </w:rPr>
-        <w:t xml:space="preserve"> </w:t>
-      </w:r>
-      <w:r>
-        <w:rPr>
-          <w:lang w:val="en-NZ"/>
-        </w:rPr>
-        <w:t>components</w:t>
-      </w:r>
-      <w:r>
-        <w:rPr>
-          <w:lang w:val="en-NZ"/>
-        </w:rPr>
-        <w:t>,</w:t>
-      </w:r>
-      <w:r>
-        <w:rPr>
-          <w:lang w:val="en-NZ"/>
-        </w:rPr>
-        <w:t xml:space="preserve"> e.g.:</w:t>
-      </w:r>
+      <w:bookmarkStart w:id="108" w:name="_Toc900000009"/>
+      <w:r>
+        <w:rPr>
+          <w:lang w:val="en-NZ"/>
+        </w:rPr>
+        <w:t xml:space="preserve">Student view</w:t>
+      </w:r>
+      <w:bookmarkEnd w:id="108"/>
     </w:p>
     <w:p>
       <w:pPr>
@@ -1582,13 +2030,13 @@
       </w:pPr>
       <w:r>
         <w:rPr>
-          <w:noProof/>
+          <w:lang w:val="en-NZ"/>
         </w:rPr>
         <w:drawing>
-          <wp:inline distT="0" distB="0" distL="0" distR="0" wp14:anchorId="1BAB8BA0" wp14:editId="7588998B">
-            <wp:extent cx="4280400" cy="5943600"/>
-            <wp:effectExtent l="0" t="0" r="6350" b="0"/>
-            <wp:docPr id="1056184780" name="Picture 1"/>
+          <wp:inline distT="0" distB="0" distL="0" distR="0">
+            <wp:extent cx="5652000" cy="3784017"/>
+            <wp:effectExtent l="0" t="0" r="0" b="0"/>
+            <wp:docPr id="2007" name="Picture 2007"/>
             <wp:cNvGraphicFramePr>
               <a:graphicFrameLocks xmlns:a="http://schemas.openxmlformats.org/drawingml/2006/main" noChangeAspect="1"/>
             </wp:cNvGraphicFramePr>
@@ -1596,11 +2044,11 @@
               <a:graphicData uri="http://schemas.openxmlformats.org/drawingml/2006/picture">
                 <pic:pic xmlns:pic="http://schemas.openxmlformats.org/drawingml/2006/picture">
                   <pic:nvPicPr>
-                    <pic:cNvPr id="1056184780" name=""/>
+                    <pic:cNvPr id="2007" name="poll-02-student-before.png"/>
                     <pic:cNvPicPr/>
                   </pic:nvPicPr>
                   <pic:blipFill>
-                    <a:blip r:embed="rId12"/>
+                    <a:blip r:embed="rId107"/>
                     <a:stretch>
                       <a:fillRect/>
                     </a:stretch>
@@ -1608,7 +2056,7 @@
                   <pic:spPr>
                     <a:xfrm>
                       <a:off x="0" y="0"/>
-                      <a:ext cx="4280400" cy="5943600"/>
+                      <a:ext cx="5652000" cy="3784017"/>
                     </a:xfrm>
                     <a:prstGeom prst="rect">
                       <a:avLst/>
@@ -1623,20 +2071,17 @@
     </w:p>
     <w:p>
       <w:pPr>
-        <w:pStyle w:val="Heading1"/>
-        <w:rPr>
-          <w:lang w:val="en-NZ"/>
-        </w:rPr>
-      </w:pPr>
-      <w:bookmarkStart w:id="6" w:name="_Toc233545424"/>
-      <w:r>
-        <w:rPr>
-          <w:lang w:val="en-NZ"/>
-        </w:rPr>
-        <w:lastRenderedPageBreak/>
-        <w:t>Editor view</w:t>
-      </w:r>
-      <w:bookmarkEnd w:id="6"/>
+        <w:keepNext/>
+        <w:rPr>
+          <w:lang w:val="en-NZ"/>
+        </w:rPr>
+      </w:pPr>
+      <w:r>
+        <w:rPr>
+          <w:lang w:val="en-NZ"/>
+        </w:rPr>
+        <w:t xml:space="preserve">Students must select an option before seeing the results.</w:t>
+      </w:r>
     </w:p>
     <w:p>
       <w:pPr>
@@ -1650,10 +2095,10 @@
           <w:lang w:val="en-NZ"/>
         </w:rPr>
         <w:drawing>
-          <wp:inline distT="0" distB="0" distL="0" distR="0" wp14:anchorId="3B484B25" wp14:editId="5F779B70">
-            <wp:extent cx="5652000" cy="1857600"/>
-            <wp:effectExtent l="0" t="0" r="6350" b="9525"/>
-            <wp:docPr id="766958857" name="Picture 1"/>
+          <wp:inline distT="0" distB="0" distL="0" distR="0">
+            <wp:extent cx="5586200" cy="2709400"/>
+            <wp:effectExtent l="0" t="0" r="0" b="0"/>
+            <wp:docPr id="2008" name="Picture 2008"/>
             <wp:cNvGraphicFramePr>
               <a:graphicFrameLocks xmlns:a="http://schemas.openxmlformats.org/drawingml/2006/main" noChangeAspect="1"/>
             </wp:cNvGraphicFramePr>
@@ -1661,11 +2106,11 @@
               <a:graphicData uri="http://schemas.openxmlformats.org/drawingml/2006/picture">
                 <pic:pic xmlns:pic="http://schemas.openxmlformats.org/drawingml/2006/picture">
                   <pic:nvPicPr>
-                    <pic:cNvPr id="766958857" name=""/>
+                    <pic:cNvPr id="2008" name="poll-03-student-voted.png"/>
                     <pic:cNvPicPr/>
                   </pic:nvPicPr>
                   <pic:blipFill>
-                    <a:blip r:embed="rId13"/>
+                    <a:blip r:embed="rId108"/>
                     <a:stretch>
                       <a:fillRect/>
                     </a:stretch>
@@ -1673,7 +2118,7 @@
                   <pic:spPr>
                     <a:xfrm>
                       <a:off x="0" y="0"/>
-                      <a:ext cx="5652000" cy="1857600"/>
+                      <a:ext cx="5586200" cy="2709400"/>
                     </a:xfrm>
                     <a:prstGeom prst="rect">
                       <a:avLst/>
@@ -1688,19 +2133,299 @@
     </w:p>
     <w:p>
       <w:pPr>
+        <w:keepNext/>
+        <w:rPr>
+          <w:lang w:val="en-NZ"/>
+        </w:rPr>
+      </w:pPr>
+      <w:r>
+        <w:rPr>
+          <w:lang w:val="en-NZ"/>
+        </w:rPr>
+        <w:t xml:space="preserve">Students can change their response.</w:t>
+      </w:r>
+    </w:p>
+    <w:p>
+      <w:pPr>
+        <w:jc w:val="center"/>
+        <w:rPr>
+          <w:lang w:val="en-NZ"/>
+        </w:rPr>
+      </w:pPr>
+      <w:r>
+        <w:rPr>
+          <w:lang w:val="en-NZ"/>
+        </w:rPr>
+        <w:drawing>
+          <wp:inline distT="0" distB="0" distL="0" distR="0">
+            <wp:extent cx="5586200" cy="2709400"/>
+            <wp:effectExtent l="0" t="0" r="0" b="0"/>
+            <wp:docPr id="2009" name="Picture 2009"/>
+            <wp:cNvGraphicFramePr>
+              <a:graphicFrameLocks xmlns:a="http://schemas.openxmlformats.org/drawingml/2006/main" noChangeAspect="1"/>
+            </wp:cNvGraphicFramePr>
+            <a:graphic xmlns:a="http://schemas.openxmlformats.org/drawingml/2006/main">
+              <a:graphicData uri="http://schemas.openxmlformats.org/drawingml/2006/picture">
+                <pic:pic xmlns:pic="http://schemas.openxmlformats.org/drawingml/2006/picture">
+                  <pic:nvPicPr>
+                    <pic:cNvPr id="2009" name="poll-04-student-changed.png"/>
+                    <pic:cNvPicPr/>
+                  </pic:nvPicPr>
+                  <pic:blipFill>
+                    <a:blip r:embed="rId109"/>
+                    <a:stretch>
+                      <a:fillRect/>
+                    </a:stretch>
+                  </pic:blipFill>
+                  <pic:spPr>
+                    <a:xfrm>
+                      <a:off x="0" y="0"/>
+                      <a:ext cx="5586200" cy="2709400"/>
+                    </a:xfrm>
+                    <a:prstGeom prst="rect">
+                      <a:avLst/>
+                    </a:prstGeom>
+                  </pic:spPr>
+                </pic:pic>
+              </a:graphicData>
+            </a:graphic>
+          </wp:inline>
+        </w:drawing>
+      </w:r>
+    </w:p>
+    <w:p>
+      <w:pPr>
         <w:pStyle w:val="Heading1"/>
         <w:rPr>
           <w:lang w:val="en-NZ"/>
         </w:rPr>
       </w:pPr>
-      <w:bookmarkStart w:id="7" w:name="_Toc233545425"/>
-      <w:r>
-        <w:rPr>
-          <w:lang w:val="en-NZ"/>
-        </w:rPr>
-        <w:t>Limitations</w:t>
-      </w:r>
-      <w:bookmarkEnd w:id="7"/>
+      <w:bookmarkStart w:id="109" w:name="_Toc900000010"/>
+      <w:r>
+        <w:rPr>
+          <w:lang w:val="en-NZ"/>
+        </w:rPr>
+        <w:t xml:space="preserve">Multiple polls</w:t>
+      </w:r>
+      <w:bookmarkEnd w:id="109"/>
+    </w:p>
+    <w:p>
+      <w:pPr>
+        <w:keepNext/>
+        <w:rPr>
+          <w:lang w:val="en-NZ"/>
+        </w:rPr>
+      </w:pPr>
+      <w:r>
+        <w:rPr>
+          <w:lang w:val="en-NZ"/>
+        </w:rPr>
+        <w:t xml:space="preserve">There can be multiple polls within a book chapter or label, e.g.:</w:t>
+      </w:r>
+    </w:p>
+    <w:p>
+      <w:pPr>
+        <w:jc w:val="center"/>
+        <w:rPr>
+          <w:lang w:val="en-NZ"/>
+        </w:rPr>
+      </w:pPr>
+      <w:r>
+        <w:rPr>
+          <w:lang w:val="en-NZ"/>
+        </w:rPr>
+        <w:drawing>
+          <wp:inline distT="0" distB="0" distL="0" distR="0">
+            <wp:extent cx="5586200" cy="4922800"/>
+            <wp:effectExtent l="0" t="0" r="0" b="0"/>
+            <wp:docPr id="2010" name="Picture 2010"/>
+            <wp:cNvGraphicFramePr>
+              <a:graphicFrameLocks xmlns:a="http://schemas.openxmlformats.org/drawingml/2006/main" noChangeAspect="1"/>
+            </wp:cNvGraphicFramePr>
+            <a:graphic xmlns:a="http://schemas.openxmlformats.org/drawingml/2006/main">
+              <a:graphicData uri="http://schemas.openxmlformats.org/drawingml/2006/picture">
+                <pic:pic xmlns:pic="http://schemas.openxmlformats.org/drawingml/2006/picture">
+                  <pic:nvPicPr>
+                    <pic:cNvPr id="2010" name="poll-05-multiple-polls.png"/>
+                    <pic:cNvPicPr/>
+                  </pic:nvPicPr>
+                  <pic:blipFill>
+                    <a:blip r:embed="rId110"/>
+                    <a:stretch>
+                      <a:fillRect/>
+                    </a:stretch>
+                  </pic:blipFill>
+                  <pic:spPr>
+                    <a:xfrm>
+                      <a:off x="0" y="0"/>
+                      <a:ext cx="5586200" cy="4922800"/>
+                    </a:xfrm>
+                    <a:prstGeom prst="rect">
+                      <a:avLst/>
+                    </a:prstGeom>
+                  </pic:spPr>
+                </pic:pic>
+              </a:graphicData>
+            </a:graphic>
+          </wp:inline>
+        </w:drawing>
+      </w:r>
+    </w:p>
+    <w:p>
+      <w:pPr>
+        <w:keepNext/>
+        <w:rPr>
+          <w:lang w:val="en-NZ"/>
+        </w:rPr>
+      </w:pPr>
+      <w:r>
+        <w:rPr>
+          <w:lang w:val="en-NZ"/>
+        </w:rPr>
+        <w:t xml:space="preserve">You can have multiple polls with the same options, e.g.:</w:t>
+      </w:r>
+    </w:p>
+    <w:p>
+      <w:pPr>
+        <w:jc w:val="center"/>
+        <w:rPr>
+          <w:lang w:val="en-NZ"/>
+        </w:rPr>
+      </w:pPr>
+      <w:r>
+        <w:rPr>
+          <w:lang w:val="en-NZ"/>
+        </w:rPr>
+        <w:drawing>
+          <wp:inline distT="0" distB="0" distL="0" distR="0">
+            <wp:extent cx="5586200" cy="5009600"/>
+            <wp:effectExtent l="0" t="0" r="0" b="0"/>
+            <wp:docPr id="2011" name="Picture 2011"/>
+            <wp:cNvGraphicFramePr>
+              <a:graphicFrameLocks xmlns:a="http://schemas.openxmlformats.org/drawingml/2006/main" noChangeAspect="1"/>
+            </wp:cNvGraphicFramePr>
+            <a:graphic xmlns:a="http://schemas.openxmlformats.org/drawingml/2006/main">
+              <a:graphicData uri="http://schemas.openxmlformats.org/drawingml/2006/picture">
+                <pic:pic xmlns:pic="http://schemas.openxmlformats.org/drawingml/2006/picture">
+                  <pic:nvPicPr>
+                    <pic:cNvPr id="2011" name="poll-06-same-options.png"/>
+                    <pic:cNvPicPr/>
+                  </pic:nvPicPr>
+                  <pic:blipFill>
+                    <a:blip r:embed="rId111"/>
+                    <a:stretch>
+                      <a:fillRect/>
+                    </a:stretch>
+                  </pic:blipFill>
+                  <pic:spPr>
+                    <a:xfrm>
+                      <a:off x="0" y="0"/>
+                      <a:ext cx="5586200" cy="5009600"/>
+                    </a:xfrm>
+                    <a:prstGeom prst="rect">
+                      <a:avLst/>
+                    </a:prstGeom>
+                  </pic:spPr>
+                </pic:pic>
+              </a:graphicData>
+            </a:graphic>
+          </wp:inline>
+        </w:drawing>
+      </w:r>
+    </w:p>
+    <w:p>
+      <w:pPr>
+        <w:pStyle w:val="Heading1"/>
+        <w:rPr>
+          <w:lang w:val="en-NZ"/>
+        </w:rPr>
+      </w:pPr>
+      <w:bookmarkStart w:id="110" w:name="_Toc900000011"/>
+      <w:r>
+        <w:rPr>
+          <w:lang w:val="en-NZ"/>
+        </w:rPr>
+        <w:t xml:space="preserve">Compatible with C4L components</w:t>
+      </w:r>
+      <w:bookmarkEnd w:id="110"/>
+    </w:p>
+    <w:p>
+      <w:pPr>
+        <w:keepNext/>
+        <w:rPr>
+          <w:lang w:val="en-NZ"/>
+        </w:rPr>
+      </w:pPr>
+      <w:r>
+        <w:rPr>
+          <w:lang w:val="en-NZ"/>
+        </w:rPr>
+        <w:t xml:space="preserve">Embedded polls can sit inside most C4L components, e.g.:</w:t>
+      </w:r>
+    </w:p>
+    <w:p>
+      <w:pPr>
+        <w:jc w:val="center"/>
+        <w:rPr>
+          <w:lang w:val="en-NZ"/>
+        </w:rPr>
+      </w:pPr>
+      <w:r>
+        <w:rPr>
+          <w:lang w:val="en-NZ"/>
+        </w:rPr>
+        <w:drawing>
+          <wp:inline distT="0" distB="0" distL="0" distR="0">
+            <wp:extent cx="5586200" cy="6094600"/>
+            <wp:effectExtent l="0" t="0" r="0" b="0"/>
+            <wp:docPr id="2012" name="Picture 2012"/>
+            <wp:cNvGraphicFramePr>
+              <a:graphicFrameLocks xmlns:a="http://schemas.openxmlformats.org/drawingml/2006/main" noChangeAspect="1"/>
+            </wp:cNvGraphicFramePr>
+            <a:graphic xmlns:a="http://schemas.openxmlformats.org/drawingml/2006/main">
+              <a:graphicData uri="http://schemas.openxmlformats.org/drawingml/2006/picture">
+                <pic:pic xmlns:pic="http://schemas.openxmlformats.org/drawingml/2006/picture">
+                  <pic:nvPicPr>
+                    <pic:cNvPr id="2012" name="poll-07-c4l.png"/>
+                    <pic:cNvPicPr/>
+                  </pic:nvPicPr>
+                  <pic:blipFill>
+                    <a:blip r:embed="rId112"/>
+                    <a:stretch>
+                      <a:fillRect/>
+                    </a:stretch>
+                  </pic:blipFill>
+                  <pic:spPr>
+                    <a:xfrm>
+                      <a:off x="0" y="0"/>
+                      <a:ext cx="5586200" cy="6094600"/>
+                    </a:xfrm>
+                    <a:prstGeom prst="rect">
+                      <a:avLst/>
+                    </a:prstGeom>
+                  </pic:spPr>
+                </pic:pic>
+              </a:graphicData>
+            </a:graphic>
+          </wp:inline>
+        </w:drawing>
+      </w:r>
+    </w:p>
+    <w:p>
+      <w:pPr>
+        <w:pStyle w:val="Heading1"/>
+        <w:rPr>
+          <w:lang w:val="en-NZ"/>
+        </w:rPr>
+      </w:pPr>
+      <w:bookmarkStart w:id="111" w:name="_Toc900000012"/>
+      <w:r>
+        <w:rPr>
+          <w:lang w:val="en-NZ"/>
+        </w:rPr>
+        <w:t xml:space="preserve">Limitations</w:t>
+      </w:r>
+      <w:bookmarkEnd w:id="111"/>
     </w:p>
     <w:p>
       <w:pPr>
@@ -1717,31 +2442,7 @@
         <w:rPr>
           <w:lang w:val="en-NZ"/>
         </w:rPr>
-        <w:t xml:space="preserve">If you edit the </w:t>
-      </w:r>
-      <w:r>
-        <w:rPr>
-          <w:lang w:val="en-NZ"/>
-        </w:rPr>
-        <w:t>poll text or the order of the options, it effectively becomes a new poll,</w:t>
-      </w:r>
-      <w:r>
-        <w:rPr>
-          <w:lang w:val="en-NZ"/>
-        </w:rPr>
-        <w:t xml:space="preserve"> and existing results are lost</w:t>
-      </w:r>
-      <w:r>
-        <w:rPr>
-          <w:lang w:val="en-NZ"/>
-        </w:rPr>
-        <w:t xml:space="preserve"> (disconnected)</w:t>
-      </w:r>
-      <w:r>
-        <w:rPr>
-          <w:lang w:val="en-NZ"/>
-        </w:rPr>
-        <w:t>.</w:t>
+        <w:t xml:space="preserve">Rewording or removing an option discards the votes cast for that option (see Editing a poll that has votes).</w:t>
       </w:r>
     </w:p>
     <w:p>
@@ -1759,67 +2460,7 @@
         <w:rPr>
           <w:lang w:val="en-NZ"/>
         </w:rPr>
-        <w:t xml:space="preserve">You can move </w:t>
-      </w:r>
-      <w:r>
-        <w:rPr>
-          <w:lang w:val="en-NZ"/>
-        </w:rPr>
-        <w:t xml:space="preserve">(reorder) individual </w:t>
-      </w:r>
-      <w:r>
-        <w:rPr>
-          <w:lang w:val="en-NZ"/>
-        </w:rPr>
-        <w:t>polls</w:t>
-      </w:r>
-      <w:r>
-        <w:rPr>
-          <w:lang w:val="en-NZ"/>
-        </w:rPr>
-        <w:t xml:space="preserve"> with a book chapter or label</w:t>
-      </w:r>
-      <w:r>
-        <w:rPr>
-          <w:lang w:val="en-NZ"/>
-        </w:rPr>
-        <w:t>,</w:t>
-      </w:r>
-      <w:r>
-        <w:rPr>
-          <w:lang w:val="en-NZ"/>
-        </w:rPr>
-        <w:t xml:space="preserve"> and the results will be retained</w:t>
-      </w:r>
-      <w:r>
-        <w:rPr>
-          <w:lang w:val="en-NZ"/>
-        </w:rPr>
-        <w:t>.</w:t>
-      </w:r>
-      <w:r>
-        <w:rPr>
-          <w:lang w:val="en-NZ"/>
-        </w:rPr>
-        <w:t xml:space="preserve"> The exception is </w:t>
-      </w:r>
-      <w:r>
-        <w:rPr>
-          <w:lang w:val="en-NZ"/>
-        </w:rPr>
-        <w:t>identical polls – the results will remain in the original order.</w:t>
-      </w:r>
-      <w:r>
-        <w:rPr>
-          <w:lang w:val="en-NZ"/>
-        </w:rPr>
-        <w:t xml:space="preserve"> For example, in the sample above with two Yes/No polls, if you </w:t>
-      </w:r>
-      <w:r>
-        <w:rPr>
-          <w:lang w:val="en-NZ"/>
-        </w:rPr>
-        <w:t>move example 2 content above example 1 content, the example 2 poll (now first) will include the example 1 results.</w:t>
+        <w:t xml:space="preserve">A poll that is copied and pasted within the same activity (for example, from one book chapter to another) is the same poll in both places, and the copies share their votes. To add another poll, use the Poll button.</w:t>
       </w:r>
     </w:p>
     <w:p>
@@ -1837,19 +2478,25 @@
         <w:rPr>
           <w:lang w:val="en-NZ"/>
         </w:rPr>
-        <w:t xml:space="preserve">Embedded polls may work in other contexts, e.g., Page activities, or Course section summaries, but those have not been </w:t>
-      </w:r>
-      <w:r>
-        <w:rPr>
-          <w:lang w:val="en-NZ"/>
-        </w:rPr>
-        <w:t xml:space="preserve">comprehensively </w:t>
-      </w:r>
-      <w:r>
-        <w:rPr>
-          <w:lang w:val="en-NZ"/>
-        </w:rPr>
-        <w:t>tested.</w:t>
+        <w:t xml:space="preserve">A poll that is copied and pasted into a different activity does not show there: teachers see a notice, and students see nothing. Add the poll again with the Poll button. Duplicating an activity or section, importing, and copying a course all work as expected, and each copy gets its own poll.</w:t>
+      </w:r>
+    </w:p>
+    <w:p>
+      <w:pPr>
+        <w:pStyle w:val="ListParagraph"/>
+        <w:numPr>
+          <w:ilvl w:val="0"/>
+          <w:numId w:val="2"/>
+        </w:numPr>
+        <w:rPr>
+          <w:lang w:val="en-NZ"/>
+        </w:rPr>
+      </w:pPr>
+      <w:r>
+        <w:rPr>
+          <w:lang w:val="en-NZ"/>
+        </w:rPr>
+        <w:t xml:space="preserve">Polls can only be added and edited in the TinyMCE editor.</w:t>
       </w:r>
     </w:p>
     <w:p>
@@ -1862,23 +2509,35 @@
     <w:p>
       <w:pPr>
         <w:pStyle w:val="Heading1"/>
-        <w:pageBreakBefore/>
-        <w:rPr>
-          <w:lang w:val="en-NZ"/>
-        </w:rPr>
-      </w:pPr>
-      <w:r>
-        <w:rPr>
-          <w:lang w:val="en-NZ"/>
-        </w:rPr>
-        <w:lastRenderedPageBreak/>
-        <w:t>Testing samples</w:t>
-      </w:r>
-    </w:p>
-    <w:p>
-      <w:pPr>
-        <w:rPr>
-          <w:noProof/>
+        <w:rPr>
+          <w:lang w:val="en-NZ"/>
+        </w:rPr>
+      </w:pPr>
+      <w:bookmarkStart w:id="112" w:name="_Toc900000013"/>
+      <w:r>
+        <w:rPr>
+          <w:lang w:val="en-NZ"/>
+        </w:rPr>
+        <w:t xml:space="preserve">Testing samples</w:t>
+      </w:r>
+      <w:bookmarkEnd w:id="112"/>
+    </w:p>
+    <w:p>
+      <w:pPr>
+        <w:rPr>
+          <w:lang w:val="en-NZ"/>
+        </w:rPr>
+      </w:pPr>
+      <w:r>
+        <w:rPr>
+          <w:lang w:val="en-NZ"/>
+        </w:rPr>
+        <w:t xml:space="preserve">Each sample lists its options separated by “/”. In the poll form, enter each option on its own line.</w:t>
+      </w:r>
+    </w:p>
+    <w:p>
+      <w:pPr>
+        <w:rPr>
           <w:lang w:val="en-NZ"/>
         </w:rPr>
       </w:pPr>
@@ -1886,106 +2545,92 @@
         <w:rPr>
           <w:b/>
           <w:bCs/>
-          <w:noProof/>
-          <w:lang w:val="en-NZ"/>
-        </w:rPr>
-        <w:t>Binary / two-choice</w:t>
-      </w:r>
-    </w:p>
-    <w:p>
-      <w:pPr>
-        <w:rPr>
-          <w:noProof/>
-          <w:lang w:val="en-NZ"/>
-        </w:rPr>
-      </w:pPr>
-      <w:r>
-        <w:rPr>
-          <w:noProof/>
-          <w:lang w:val="en-NZ"/>
-        </w:rPr>
-        <w:t>{poll:"Yes","No"}</w:t>
-      </w:r>
-    </w:p>
-    <w:p>
-      <w:pPr>
-        <w:rPr>
-          <w:noProof/>
-          <w:lang w:val="en-NZ"/>
-        </w:rPr>
-      </w:pPr>
-      <w:r>
-        <w:rPr>
-          <w:noProof/>
-          <w:lang w:val="en-NZ"/>
-        </w:rPr>
-        <w:t>{poll:"True","False"}</w:t>
-      </w:r>
-    </w:p>
-    <w:p>
-      <w:pPr>
-        <w:rPr>
-          <w:noProof/>
-          <w:lang w:val="en-NZ"/>
-        </w:rPr>
-      </w:pPr>
-      <w:r>
-        <w:rPr>
-          <w:noProof/>
-          <w:lang w:val="en-NZ"/>
-        </w:rPr>
-        <w:t>{poll:"Agree","Disagree"}</w:t>
-      </w:r>
-    </w:p>
-    <w:p>
-      <w:pPr>
-        <w:rPr>
-          <w:noProof/>
-          <w:lang w:val="en-NZ"/>
-        </w:rPr>
-      </w:pPr>
-      <w:r>
-        <w:rPr>
-          <w:noProof/>
-          <w:lang w:val="en-NZ"/>
-        </w:rPr>
-        <w:t>{poll:"For","Against"}</w:t>
-      </w:r>
-    </w:p>
-    <w:p>
-      <w:pPr>
-        <w:rPr>
-          <w:noProof/>
-          <w:lang w:val="en-NZ"/>
-        </w:rPr>
-      </w:pPr>
-      <w:r>
-        <w:rPr>
-          <w:noProof/>
-          <w:lang w:val="en-NZ"/>
-        </w:rPr>
-        <w:t>{poll:"Pass","Fail"}</w:t>
-      </w:r>
-    </w:p>
-    <w:p>
-      <w:pPr>
-        <w:rPr>
-          <w:noProof/>
-          <w:lang w:val="en-NZ"/>
-        </w:rPr>
-      </w:pPr>
-      <w:r>
-        <w:rPr>
-          <w:noProof/>
-          <w:lang w:val="en-NZ"/>
-        </w:rPr>
-        <w:t>{poll:"Like","Dislike"}</w:t>
-      </w:r>
-    </w:p>
-    <w:p>
-      <w:pPr>
-        <w:rPr>
-          <w:noProof/>
+          <w:lang w:val="en-NZ"/>
+        </w:rPr>
+        <w:t xml:space="preserve">Binary / two-choice</w:t>
+      </w:r>
+    </w:p>
+    <w:p>
+      <w:pPr>
+        <w:rPr>
+          <w:lang w:val="en-NZ"/>
+        </w:rPr>
+      </w:pPr>
+      <w:r>
+        <w:rPr>
+          <w:lang w:val="en-NZ"/>
+        </w:rPr>
+        <w:t xml:space="preserve">Yes / No</w:t>
+      </w:r>
+    </w:p>
+    <w:p>
+      <w:pPr>
+        <w:rPr>
+          <w:lang w:val="en-NZ"/>
+        </w:rPr>
+      </w:pPr>
+      <w:r>
+        <w:rPr>
+          <w:lang w:val="en-NZ"/>
+        </w:rPr>
+        <w:t xml:space="preserve">True / False</w:t>
+      </w:r>
+    </w:p>
+    <w:p>
+      <w:pPr>
+        <w:rPr>
+          <w:lang w:val="en-NZ"/>
+        </w:rPr>
+      </w:pPr>
+      <w:r>
+        <w:rPr>
+          <w:lang w:val="en-NZ"/>
+        </w:rPr>
+        <w:t xml:space="preserve">Agree / Disagree</w:t>
+      </w:r>
+    </w:p>
+    <w:p>
+      <w:pPr>
+        <w:rPr>
+          <w:lang w:val="en-NZ"/>
+        </w:rPr>
+      </w:pPr>
+      <w:r>
+        <w:rPr>
+          <w:lang w:val="en-NZ"/>
+        </w:rPr>
+        <w:t xml:space="preserve">For / Against</w:t>
+      </w:r>
+    </w:p>
+    <w:p>
+      <w:pPr>
+        <w:rPr>
+          <w:lang w:val="en-NZ"/>
+        </w:rPr>
+      </w:pPr>
+      <w:r>
+        <w:rPr>
+          <w:lang w:val="en-NZ"/>
+        </w:rPr>
+        <w:t xml:space="preserve">Pass / Fail</w:t>
+      </w:r>
+    </w:p>
+    <w:p>
+      <w:pPr>
+        <w:rPr>
+          <w:lang w:val="en-NZ"/>
+        </w:rPr>
+      </w:pPr>
+      <w:r>
+        <w:rPr>
+          <w:lang w:val="en-NZ"/>
+        </w:rPr>
+        <w:t xml:space="preserve">Like / Dislike</w:t>
+      </w:r>
+    </w:p>
+    <w:p>
+      <w:pPr>
+        <w:rPr>
           <w:lang w:val="en-NZ"/>
         </w:rPr>
       </w:pPr>
@@ -1993,91 +2638,79 @@
         <w:rPr>
           <w:b/>
           <w:bCs/>
-          <w:noProof/>
-          <w:lang w:val="en-NZ"/>
-        </w:rPr>
-        <w:t>Three-point</w:t>
-      </w:r>
-    </w:p>
-    <w:p>
-      <w:pPr>
-        <w:rPr>
-          <w:noProof/>
-          <w:lang w:val="en-NZ"/>
-        </w:rPr>
-      </w:pPr>
-      <w:r>
-        <w:rPr>
-          <w:noProof/>
-          <w:lang w:val="en-NZ"/>
-        </w:rPr>
-        <w:t>{poll:"Yes","No","Maybe"}</w:t>
-      </w:r>
-    </w:p>
-    <w:p>
-      <w:pPr>
-        <w:rPr>
-          <w:noProof/>
-          <w:lang w:val="en-NZ"/>
-        </w:rPr>
-      </w:pPr>
-      <w:r>
-        <w:rPr>
-          <w:noProof/>
-          <w:lang w:val="en-NZ"/>
-        </w:rPr>
-        <w:t>{poll:"Agree","Neutral","Disagree"}</w:t>
-      </w:r>
-    </w:p>
-    <w:p>
-      <w:pPr>
-        <w:rPr>
-          <w:noProof/>
-          <w:lang w:val="en-NZ"/>
-        </w:rPr>
-      </w:pPr>
-      <w:r>
-        <w:rPr>
-          <w:noProof/>
-          <w:lang w:val="en-NZ"/>
-        </w:rPr>
-        <w:t>{poll:"Better","Same","Worse"}</w:t>
-      </w:r>
-    </w:p>
-    <w:p>
-      <w:pPr>
-        <w:rPr>
-          <w:noProof/>
-          <w:lang w:val="en-NZ"/>
-        </w:rPr>
-      </w:pPr>
-      <w:r>
-        <w:rPr>
-          <w:noProof/>
-          <w:lang w:val="en-NZ"/>
-        </w:rPr>
-        <w:t>{poll:"Good","Okay","Bad"}</w:t>
-      </w:r>
-    </w:p>
-    <w:p>
-      <w:pPr>
-        <w:rPr>
-          <w:noProof/>
-          <w:lang w:val="en-NZ"/>
-        </w:rPr>
-      </w:pPr>
-      <w:r>
-        <w:rPr>
-          <w:noProof/>
-          <w:lang w:val="en-NZ"/>
-        </w:rPr>
-        <w:t>{poll:"Thumbs up","Sideways","Down"}</w:t>
-      </w:r>
-    </w:p>
-    <w:p>
-      <w:pPr>
-        <w:rPr>
-          <w:noProof/>
+          <w:lang w:val="en-NZ"/>
+        </w:rPr>
+        <w:t xml:space="preserve">Three-point</w:t>
+      </w:r>
+    </w:p>
+    <w:p>
+      <w:pPr>
+        <w:rPr>
+          <w:lang w:val="en-NZ"/>
+        </w:rPr>
+      </w:pPr>
+      <w:r>
+        <w:rPr>
+          <w:lang w:val="en-NZ"/>
+        </w:rPr>
+        <w:t xml:space="preserve">Yes / No / Maybe</w:t>
+      </w:r>
+    </w:p>
+    <w:p>
+      <w:pPr>
+        <w:rPr>
+          <w:lang w:val="en-NZ"/>
+        </w:rPr>
+      </w:pPr>
+      <w:r>
+        <w:rPr>
+          <w:lang w:val="en-NZ"/>
+        </w:rPr>
+        <w:t xml:space="preserve">Agree / Neutral / Disagree</w:t>
+      </w:r>
+    </w:p>
+    <w:p>
+      <w:pPr>
+        <w:rPr>
+          <w:lang w:val="en-NZ"/>
+        </w:rPr>
+      </w:pPr>
+      <w:r>
+        <w:rPr>
+          <w:lang w:val="en-NZ"/>
+        </w:rPr>
+        <w:t xml:space="preserve">Better / Same / Worse</w:t>
+      </w:r>
+    </w:p>
+    <w:p>
+      <w:pPr>
+        <w:rPr>
+          <w:lang w:val="en-NZ"/>
+        </w:rPr>
+      </w:pPr>
+      <w:r>
+        <w:rPr>
+          <w:lang w:val="en-NZ"/>
+        </w:rPr>
+        <w:t xml:space="preserve">Good / Okay / Bad</w:t>
+      </w:r>
+    </w:p>
+    <w:p>
+      <w:pPr>
+        <w:rPr>
+          <w:lang w:val="en-NZ"/>
+        </w:rPr>
+      </w:pPr>
+      <w:r>
+        <w:rPr>
+          <w:lang w:val="en-NZ"/>
+        </w:rPr>
+        <w:t xml:space="preserve">Thumbs up / Sideways / Down</w:t>
+      </w:r>
+    </w:p>
+    <w:p>
+      <w:pPr>
+        <w:rPr>
           <w:lang w:val="en-NZ"/>
         </w:rPr>
       </w:pPr>
@@ -2085,76 +2718,66 @@
         <w:rPr>
           <w:b/>
           <w:bCs/>
-          <w:noProof/>
-          <w:lang w:val="en-NZ"/>
-        </w:rPr>
-        <w:t>Likert scales (5-point)</w:t>
-      </w:r>
-    </w:p>
-    <w:p>
-      <w:pPr>
-        <w:rPr>
-          <w:noProof/>
-          <w:lang w:val="en-NZ"/>
-        </w:rPr>
-      </w:pPr>
-      <w:r>
-        <w:rPr>
-          <w:noProof/>
-          <w:lang w:val="en-NZ"/>
-        </w:rPr>
-        <w:t>{poll:"Strongly Disagree","Disagree","Neutral","Agree","Strongly Agree"}</w:t>
-      </w:r>
-    </w:p>
-    <w:p>
-      <w:pPr>
-        <w:rPr>
-          <w:noProof/>
-          <w:lang w:val="en-NZ"/>
-        </w:rPr>
-      </w:pPr>
-      <w:r>
-        <w:rPr>
-          <w:noProof/>
-          <w:lang w:val="en-NZ"/>
-        </w:rPr>
-        <w:t>{poll:"Very Dissatisfied","Dissatisfied","Neutral","Satisfied","Very Satisfied"}</w:t>
-      </w:r>
-    </w:p>
-    <w:p>
-      <w:pPr>
-        <w:rPr>
-          <w:noProof/>
-          <w:lang w:val="en-NZ"/>
-        </w:rPr>
-      </w:pPr>
-      <w:r>
-        <w:rPr>
-          <w:noProof/>
-          <w:lang w:val="en-NZ"/>
-        </w:rPr>
-        <w:t>{poll:"Never","Rarely","Sometimes","Often","Always"}</w:t>
-      </w:r>
-    </w:p>
-    <w:p>
-      <w:pPr>
-        <w:rPr>
-          <w:noProof/>
-          <w:lang w:val="en-NZ"/>
-        </w:rPr>
-      </w:pPr>
-      <w:r>
-        <w:rPr>
-          <w:noProof/>
-          <w:lang w:val="en-NZ"/>
-        </w:rPr>
-        <w:t>{poll:"Poor","Fair","Good","Very Good","Excellent"}</w:t>
-      </w:r>
-    </w:p>
-    <w:p>
-      <w:pPr>
-        <w:rPr>
-          <w:noProof/>
+          <w:lang w:val="en-NZ"/>
+        </w:rPr>
+        <w:t xml:space="preserve">Likert scales (5-point)</w:t>
+      </w:r>
+    </w:p>
+    <w:p>
+      <w:pPr>
+        <w:rPr>
+          <w:lang w:val="en-NZ"/>
+        </w:rPr>
+      </w:pPr>
+      <w:r>
+        <w:rPr>
+          <w:lang w:val="en-NZ"/>
+        </w:rPr>
+        <w:t xml:space="preserve">Strongly Disagree / Disagree / Neutral / Agree / Strongly Agree</w:t>
+      </w:r>
+    </w:p>
+    <w:p>
+      <w:pPr>
+        <w:rPr>
+          <w:lang w:val="en-NZ"/>
+        </w:rPr>
+      </w:pPr>
+      <w:r>
+        <w:rPr>
+          <w:lang w:val="en-NZ"/>
+        </w:rPr>
+        <w:t xml:space="preserve">Very Dissatisfied / Dissatisfied / Neutral / Satisfied / Very Satisfied</w:t>
+      </w:r>
+    </w:p>
+    <w:p>
+      <w:pPr>
+        <w:rPr>
+          <w:lang w:val="en-NZ"/>
+        </w:rPr>
+      </w:pPr>
+      <w:r>
+        <w:rPr>
+          <w:lang w:val="en-NZ"/>
+        </w:rPr>
+        <w:t xml:space="preserve">Never / Rarely / Sometimes / Often / Always</w:t>
+      </w:r>
+    </w:p>
+    <w:p>
+      <w:pPr>
+        <w:rPr>
+          <w:lang w:val="en-NZ"/>
+        </w:rPr>
+      </w:pPr>
+      <w:r>
+        <w:rPr>
+          <w:lang w:val="en-NZ"/>
+        </w:rPr>
+        <w:t xml:space="preserve">Poor / Fair / Good / Very Good / Excellent</w:t>
+      </w:r>
+    </w:p>
+    <w:p>
+      <w:pPr>
+        <w:rPr>
           <w:lang w:val="en-NZ"/>
         </w:rPr>
       </w:pPr>
@@ -2162,31 +2785,27 @@
         <w:rPr>
           <w:b/>
           <w:bCs/>
-          <w:noProof/>
-          <w:lang w:val="en-NZ"/>
-        </w:rPr>
-        <w:t>7-point</w:t>
-      </w:r>
-    </w:p>
-    <w:p>
-      <w:pPr>
-        <w:rPr>
-          <w:noProof/>
-          <w:lang w:val="en-NZ"/>
-        </w:rPr>
-      </w:pPr>
-      <w:r>
-        <w:rPr>
-          <w:noProof/>
-          <w:lang w:val="en-NZ"/>
-        </w:rPr>
-        <w:t>{poll:"Strongly Disagree","Disagree","Somewhat Disagree","Neutral","Somewhat Agree","Agree","Strongly Agree"}</w:t>
-      </w:r>
-    </w:p>
-    <w:p>
-      <w:pPr>
-        <w:rPr>
-          <w:noProof/>
+          <w:lang w:val="en-NZ"/>
+        </w:rPr>
+        <w:t xml:space="preserve">7-point</w:t>
+      </w:r>
+    </w:p>
+    <w:p>
+      <w:pPr>
+        <w:rPr>
+          <w:lang w:val="en-NZ"/>
+        </w:rPr>
+      </w:pPr>
+      <w:r>
+        <w:rPr>
+          <w:lang w:val="en-NZ"/>
+        </w:rPr>
+        <w:t xml:space="preserve">Strongly Disagree / Disagree / Somewhat Disagree / Neutral / Somewhat Agree / Agree / Strongly Agree</w:t>
+      </w:r>
+    </w:p>
+    <w:p>
+      <w:pPr>
+        <w:rPr>
           <w:lang w:val="en-NZ"/>
         </w:rPr>
       </w:pPr>
@@ -2194,46 +2813,40 @@
         <w:rPr>
           <w:b/>
           <w:bCs/>
-          <w:noProof/>
-          <w:lang w:val="en-NZ"/>
-        </w:rPr>
-        <w:t>Frequency</w:t>
-      </w:r>
-    </w:p>
-    <w:p>
-      <w:pPr>
-        <w:rPr>
-          <w:noProof/>
-          <w:lang w:val="en-NZ"/>
-        </w:rPr>
-      </w:pPr>
-      <w:r>
-        <w:rPr>
-          <w:noProof/>
-          <w:lang w:val="en-NZ"/>
-        </w:rPr>
-        <w:t>{poll:"Never","Rarely","Sometimes","Often","Always"}</w:t>
-      </w:r>
-    </w:p>
-    <w:p>
-      <w:pPr>
-        <w:rPr>
-          <w:noProof/>
-          <w:lang w:val="en-NZ"/>
-        </w:rPr>
-      </w:pPr>
-      <w:r>
-        <w:rPr>
-          <w:noProof/>
-          <w:lang w:val="en-NZ"/>
-        </w:rPr>
-        <w:t>{poll:"Daily","Weekly","Monthly","Rarely","Never"}</w:t>
-      </w:r>
-    </w:p>
-    <w:p>
-      <w:pPr>
-        <w:rPr>
-          <w:noProof/>
+          <w:lang w:val="en-NZ"/>
+        </w:rPr>
+        <w:t xml:space="preserve">Frequency</w:t>
+      </w:r>
+    </w:p>
+    <w:p>
+      <w:pPr>
+        <w:rPr>
+          <w:lang w:val="en-NZ"/>
+        </w:rPr>
+      </w:pPr>
+      <w:r>
+        <w:rPr>
+          <w:lang w:val="en-NZ"/>
+        </w:rPr>
+        <w:t xml:space="preserve">Never / Rarely / Sometimes / Often / Always</w:t>
+      </w:r>
+    </w:p>
+    <w:p>
+      <w:pPr>
+        <w:rPr>
+          <w:lang w:val="en-NZ"/>
+        </w:rPr>
+      </w:pPr>
+      <w:r>
+        <w:rPr>
+          <w:lang w:val="en-NZ"/>
+        </w:rPr>
+        <w:t xml:space="preserve">Daily / Weekly / Monthly / Rarely / Never</w:t>
+      </w:r>
+    </w:p>
+    <w:p>
+      <w:pPr>
+        <w:rPr>
           <w:lang w:val="en-NZ"/>
         </w:rPr>
       </w:pPr>
@@ -2241,62 +2854,53 @@
         <w:rPr>
           <w:b/>
           <w:bCs/>
-          <w:noProof/>
-          <w:lang w:val="en-NZ"/>
-        </w:rPr>
-        <w:t>Rating / numeric</w:t>
-      </w:r>
-    </w:p>
-    <w:p>
-      <w:pPr>
-        <w:rPr>
-          <w:noProof/>
-          <w:lang w:val="en-NZ"/>
-        </w:rPr>
-      </w:pPr>
-      <w:r>
-        <w:rPr>
-          <w:noProof/>
-          <w:lang w:val="en-NZ"/>
-        </w:rPr>
-        <w:t>{poll:"1","2","3","4","5"}</w:t>
-      </w:r>
-    </w:p>
-    <w:p>
-      <w:pPr>
-        <w:rPr>
-          <w:noProof/>
-          <w:lang w:val="en-NZ"/>
-        </w:rPr>
-      </w:pPr>
-      <w:r>
-        <w:rPr>
-          <w:noProof/>
-          <w:lang w:val="en-NZ"/>
-        </w:rPr>
-        <w:t>{poll:"1","2","3","4","5","6","7","8","9","10"}</w:t>
-      </w:r>
-    </w:p>
-    <w:p>
-      <w:pPr>
-        <w:rPr>
-          <w:noProof/>
-          <w:lang w:val="en-NZ"/>
-        </w:rPr>
-      </w:pPr>
-      <w:r>
-        <w:rPr>
-          <w:noProof/>
-          <w:lang w:val="en-NZ"/>
-        </w:rPr>
-        <w:lastRenderedPageBreak/>
-        <w:t>{poll:"A","B","C","D","F"}</w:t>
-      </w:r>
-    </w:p>
-    <w:p>
-      <w:pPr>
-        <w:rPr>
-          <w:noProof/>
+          <w:lang w:val="en-NZ"/>
+        </w:rPr>
+        <w:t xml:space="preserve">Rating / numeric</w:t>
+      </w:r>
+    </w:p>
+    <w:p>
+      <w:pPr>
+        <w:rPr>
+          <w:lang w:val="en-NZ"/>
+        </w:rPr>
+      </w:pPr>
+      <w:r>
+        <w:rPr>
+          <w:lang w:val="en-NZ"/>
+        </w:rPr>
+        <w:t xml:space="preserve">1 / 2 / 3 / 4 / 5</w:t>
+      </w:r>
+    </w:p>
+    <w:p>
+      <w:pPr>
+        <w:rPr>
+          <w:lang w:val="en-NZ"/>
+        </w:rPr>
+      </w:pPr>
+      <w:r>
+        <w:rPr>
+          <w:lang w:val="en-NZ"/>
+        </w:rPr>
+        <w:t xml:space="preserve">1 / 2 / 3 / 4 / 5 / 6 / 7 / 8 / 9 / 10</w:t>
+      </w:r>
+    </w:p>
+    <w:p>
+      <w:pPr>
+        <w:rPr>
+          <w:lang w:val="en-NZ"/>
+        </w:rPr>
+      </w:pPr>
+      <w:r>
+        <w:rPr>
+          <w:lang w:val="en-NZ"/>
+        </w:rPr>
+        <w:t xml:space="preserve">A / B / C / D / F</w:t>
+      </w:r>
+    </w:p>
+    <w:p>
+      <w:pPr>
+        <w:rPr>
           <w:lang w:val="en-NZ"/>
         </w:rPr>
       </w:pPr>
@@ -2304,61 +2908,53 @@
         <w:rPr>
           <w:b/>
           <w:bCs/>
-          <w:noProof/>
-          <w:lang w:val="en-NZ"/>
-        </w:rPr>
-        <w:t>Quality / quantity</w:t>
-      </w:r>
-    </w:p>
-    <w:p>
-      <w:pPr>
-        <w:rPr>
-          <w:noProof/>
-          <w:lang w:val="en-NZ"/>
-        </w:rPr>
-      </w:pPr>
-      <w:r>
-        <w:rPr>
-          <w:noProof/>
-          <w:lang w:val="en-NZ"/>
-        </w:rPr>
-        <w:t>{poll:"None","A little","Some","A lot"}</w:t>
-      </w:r>
-    </w:p>
-    <w:p>
-      <w:pPr>
-        <w:rPr>
-          <w:noProof/>
-          <w:lang w:val="en-NZ"/>
-        </w:rPr>
-      </w:pPr>
-      <w:r>
-        <w:rPr>
-          <w:noProof/>
-          <w:lang w:val="en-NZ"/>
-        </w:rPr>
-        <w:t>{poll:"Too little","Just right","Too much"}</w:t>
-      </w:r>
-    </w:p>
-    <w:p>
-      <w:pPr>
-        <w:rPr>
-          <w:noProof/>
-          <w:lang w:val="en-NZ"/>
-        </w:rPr>
-      </w:pPr>
-      <w:r>
-        <w:rPr>
-          <w:noProof/>
-          <w:lang w:val="en-NZ"/>
-        </w:rPr>
-        <w:t>{poll:"Low","Medium","High"}</w:t>
-      </w:r>
-    </w:p>
-    <w:p>
-      <w:pPr>
-        <w:rPr>
-          <w:noProof/>
+          <w:lang w:val="en-NZ"/>
+        </w:rPr>
+        <w:t xml:space="preserve">Quality / quantity</w:t>
+      </w:r>
+    </w:p>
+    <w:p>
+      <w:pPr>
+        <w:rPr>
+          <w:lang w:val="en-NZ"/>
+        </w:rPr>
+      </w:pPr>
+      <w:r>
+        <w:rPr>
+          <w:lang w:val="en-NZ"/>
+        </w:rPr>
+        <w:t xml:space="preserve">None / A little / Some / A lot</w:t>
+      </w:r>
+    </w:p>
+    <w:p>
+      <w:pPr>
+        <w:rPr>
+          <w:lang w:val="en-NZ"/>
+        </w:rPr>
+      </w:pPr>
+      <w:r>
+        <w:rPr>
+          <w:lang w:val="en-NZ"/>
+        </w:rPr>
+        <w:t xml:space="preserve">Too little / Just right / Too much</w:t>
+      </w:r>
+    </w:p>
+    <w:p>
+      <w:pPr>
+        <w:rPr>
+          <w:lang w:val="en-NZ"/>
+        </w:rPr>
+      </w:pPr>
+      <w:r>
+        <w:rPr>
+          <w:lang w:val="en-NZ"/>
+        </w:rPr>
+        <w:t xml:space="preserve">Low / Medium / High</w:t>
+      </w:r>
+    </w:p>
+    <w:p>
+      <w:pPr>
+        <w:rPr>
           <w:lang w:val="en-NZ"/>
         </w:rPr>
       </w:pPr>
@@ -2366,31 +2962,27 @@
         <w:rPr>
           <w:b/>
           <w:bCs/>
-          <w:noProof/>
-          <w:lang w:val="en-NZ"/>
-        </w:rPr>
-        <w:t>Importance</w:t>
-      </w:r>
-    </w:p>
-    <w:p>
-      <w:pPr>
-        <w:rPr>
-          <w:noProof/>
-          <w:lang w:val="en-NZ"/>
-        </w:rPr>
-      </w:pPr>
-      <w:r>
-        <w:rPr>
-          <w:noProof/>
-          <w:lang w:val="en-NZ"/>
-        </w:rPr>
-        <w:t>{poll:"Not important","Slightly important","Moderately important","Very important","Extremely important"}</w:t>
-      </w:r>
-    </w:p>
-    <w:p>
-      <w:pPr>
-        <w:rPr>
-          <w:noProof/>
+          <w:lang w:val="en-NZ"/>
+        </w:rPr>
+        <w:t xml:space="preserve">Importance</w:t>
+      </w:r>
+    </w:p>
+    <w:p>
+      <w:pPr>
+        <w:rPr>
+          <w:lang w:val="en-NZ"/>
+        </w:rPr>
+      </w:pPr>
+      <w:r>
+        <w:rPr>
+          <w:lang w:val="en-NZ"/>
+        </w:rPr>
+        <w:t xml:space="preserve">Not important / Slightly important / Moderately important / Very important / Extremely important</w:t>
+      </w:r>
+    </w:p>
+    <w:p>
+      <w:pPr>
+        <w:rPr>
           <w:lang w:val="en-NZ"/>
         </w:rPr>
       </w:pPr>
@@ -2398,31 +2990,27 @@
         <w:rPr>
           <w:b/>
           <w:bCs/>
-          <w:noProof/>
-          <w:lang w:val="en-NZ"/>
-        </w:rPr>
-        <w:t>Likelihood</w:t>
-      </w:r>
-    </w:p>
-    <w:p>
-      <w:pPr>
-        <w:rPr>
-          <w:noProof/>
-          <w:lang w:val="en-NZ"/>
-        </w:rPr>
-      </w:pPr>
-      <w:r>
-        <w:rPr>
-          <w:noProof/>
-          <w:lang w:val="en-NZ"/>
-        </w:rPr>
-        <w:t>{poll:"Definitely not","Probably not","Maybe","Probably","Definitely"}</w:t>
-      </w:r>
-    </w:p>
-    <w:p>
-      <w:pPr>
-        <w:rPr>
-          <w:noProof/>
+          <w:lang w:val="en-NZ"/>
+        </w:rPr>
+        <w:t xml:space="preserve">Likelihood</w:t>
+      </w:r>
+    </w:p>
+    <w:p>
+      <w:pPr>
+        <w:rPr>
+          <w:lang w:val="en-NZ"/>
+        </w:rPr>
+      </w:pPr>
+      <w:r>
+        <w:rPr>
+          <w:lang w:val="en-NZ"/>
+        </w:rPr>
+        <w:t xml:space="preserve">Definitely not / Probably not / Maybe / Probably / Definitely</w:t>
+      </w:r>
+    </w:p>
+    <w:p>
+      <w:pPr>
+        <w:rPr>
           <w:lang w:val="en-NZ"/>
         </w:rPr>
       </w:pPr>
@@ -2430,151 +3018,107 @@
         <w:rPr>
           <w:b/>
           <w:bCs/>
-          <w:noProof/>
-          <w:lang w:val="en-NZ"/>
-        </w:rPr>
-        <w:t>Emoji / reaction</w:t>
-      </w:r>
-    </w:p>
-    <w:p>
-      <w:pPr>
-        <w:rPr>
-          <w:noProof/>
-          <w:lang w:val="en-NZ"/>
-        </w:rPr>
-      </w:pPr>
-      <w:r>
-        <w:rPr>
-          <w:noProof/>
-          <w:lang w:val="en-NZ"/>
-        </w:rPr>
-        <w:t>{poll:"</w:t>
-      </w:r>
+          <w:lang w:val="en-NZ"/>
+        </w:rPr>
+        <w:t xml:space="preserve">Emoji / reaction</w:t>
+      </w:r>
+    </w:p>
+    <w:p>
+      <w:pPr>
+        <w:rPr>
+          <w:lang w:val="en-NZ"/>
+        </w:rPr>
+      </w:pPr>
       <w:r>
         <w:rPr>
           <w:rFonts w:ascii="Segoe UI Emoji" w:hAnsi="Segoe UI Emoji" w:cs="Segoe UI Emoji"/>
-          <w:noProof/>
-          <w:lang w:val="en-NZ"/>
-        </w:rPr>
-        <w:t>😍</w:t>
-      </w:r>
-      <w:r>
-        <w:rPr>
-          <w:noProof/>
-          <w:lang w:val="en-NZ"/>
-        </w:rPr>
-        <w:t>","</w:t>
+          <w:lang w:val="en-NZ"/>
+        </w:rPr>
+        <w:t xml:space="preserve">😍</w:t>
+      </w:r>
+      <w:r>
+        <w:rPr>
+          <w:lang w:val="en-NZ"/>
+        </w:rPr>
+        <w:t xml:space="preserve"> / </w:t>
       </w:r>
       <w:r>
         <w:rPr>
           <w:rFonts w:ascii="Segoe UI Emoji" w:hAnsi="Segoe UI Emoji" w:cs="Segoe UI Emoji"/>
-          <w:noProof/>
-          <w:lang w:val="en-NZ"/>
-        </w:rPr>
-        <w:t>🙂</w:t>
-      </w:r>
-      <w:r>
-        <w:rPr>
-          <w:noProof/>
-          <w:lang w:val="en-NZ"/>
-        </w:rPr>
-        <w:t>","</w:t>
+          <w:lang w:val="en-NZ"/>
+        </w:rPr>
+        <w:t xml:space="preserve">🙂</w:t>
+      </w:r>
+      <w:r>
+        <w:rPr>
+          <w:lang w:val="en-NZ"/>
+        </w:rPr>
+        <w:t xml:space="preserve"> / </w:t>
       </w:r>
       <w:r>
         <w:rPr>
           <w:rFonts w:ascii="Segoe UI Emoji" w:hAnsi="Segoe UI Emoji" w:cs="Segoe UI Emoji"/>
-          <w:noProof/>
-          <w:lang w:val="en-NZ"/>
-        </w:rPr>
-        <w:t>😐</w:t>
-      </w:r>
-      <w:r>
-        <w:rPr>
-          <w:noProof/>
-          <w:lang w:val="en-NZ"/>
-        </w:rPr>
-        <w:t>","</w:t>
+          <w:lang w:val="en-NZ"/>
+        </w:rPr>
+        <w:t xml:space="preserve">😐</w:t>
+      </w:r>
+      <w:r>
+        <w:rPr>
+          <w:lang w:val="en-NZ"/>
+        </w:rPr>
+        <w:t xml:space="preserve"> / </w:t>
       </w:r>
       <w:r>
         <w:rPr>
           <w:rFonts w:ascii="Segoe UI Emoji" w:hAnsi="Segoe UI Emoji" w:cs="Segoe UI Emoji"/>
-          <w:noProof/>
-          <w:lang w:val="en-NZ"/>
-        </w:rPr>
-        <w:t>🙁</w:t>
-      </w:r>
-      <w:r>
-        <w:rPr>
-          <w:noProof/>
-          <w:lang w:val="en-NZ"/>
-        </w:rPr>
-        <w:t>","</w:t>
+          <w:lang w:val="en-NZ"/>
+        </w:rPr>
+        <w:t xml:space="preserve">🙁</w:t>
+      </w:r>
+      <w:r>
+        <w:rPr>
+          <w:lang w:val="en-NZ"/>
+        </w:rPr>
+        <w:t xml:space="preserve"> / </w:t>
       </w:r>
       <w:r>
         <w:rPr>
           <w:rFonts w:ascii="Segoe UI Emoji" w:hAnsi="Segoe UI Emoji" w:cs="Segoe UI Emoji"/>
-          <w:noProof/>
-          <w:lang w:val="en-NZ"/>
-        </w:rPr>
-        <w:t>😠</w:t>
-      </w:r>
-      <w:r>
-        <w:rPr>
-          <w:noProof/>
-          <w:lang w:val="en-NZ"/>
-        </w:rPr>
-        <w:t>"}</w:t>
-      </w:r>
-    </w:p>
-    <w:p>
-      <w:pPr>
-        <w:rPr>
-          <w:noProof/>
-          <w:lang w:val="en-NZ"/>
-        </w:rPr>
-      </w:pPr>
-      <w:r>
-        <w:rPr>
-          <w:noProof/>
-          <w:lang w:val="en-NZ"/>
-        </w:rPr>
-        <w:t>{poll:"</w:t>
-      </w:r>
+          <w:lang w:val="en-NZ"/>
+        </w:rPr>
+        <w:t xml:space="preserve">😠</w:t>
+      </w:r>
+    </w:p>
+    <w:p>
+      <w:pPr>
+        <w:rPr>
+          <w:lang w:val="en-NZ"/>
+        </w:rPr>
+      </w:pPr>
       <w:r>
         <w:rPr>
           <w:rFonts w:ascii="Segoe UI Emoji" w:hAnsi="Segoe UI Emoji" w:cs="Segoe UI Emoji"/>
-          <w:noProof/>
-          <w:lang w:val="en-NZ"/>
-        </w:rPr>
-        <w:t>👍</w:t>
-      </w:r>
-      <w:r>
-        <w:rPr>
-          <w:noProof/>
-          <w:lang w:val="en-NZ"/>
-        </w:rPr>
-        <w:t>","</w:t>
+          <w:lang w:val="en-NZ"/>
+        </w:rPr>
+        <w:t xml:space="preserve">👍</w:t>
+      </w:r>
+      <w:r>
+        <w:rPr>
+          <w:lang w:val="en-NZ"/>
+        </w:rPr>
+        <w:t xml:space="preserve"> / </w:t>
       </w:r>
       <w:r>
         <w:rPr>
           <w:rFonts w:ascii="Segoe UI Emoji" w:hAnsi="Segoe UI Emoji" w:cs="Segoe UI Emoji"/>
-          <w:noProof/>
-          <w:lang w:val="en-NZ"/>
-        </w:rPr>
-        <w:t>👎</w:t>
-      </w:r>
-      <w:r>
-        <w:rPr>
-          <w:noProof/>
-          <w:lang w:val="en-NZ"/>
-        </w:rPr>
-        <w:t>"}</w:t>
-      </w:r>
-    </w:p>
-    <w:p>
-      <w:pPr>
-        <w:rPr>
-          <w:noProof/>
+          <w:lang w:val="en-NZ"/>
+        </w:rPr>
+        <w:t xml:space="preserve">👎</w:t>
+      </w:r>
+    </w:p>
+    <w:p>
+      <w:pPr>
+        <w:rPr>
           <w:lang w:val="en-NZ"/>
         </w:rPr>
       </w:pPr>
@@ -2582,48 +3126,36 @@
         <w:rPr>
           <w:b/>
           <w:bCs/>
-          <w:noProof/>
-          <w:lang w:val="en-NZ"/>
-        </w:rPr>
-        <w:t>Multiple choice / ranking</w:t>
-      </w:r>
-    </w:p>
-    <w:p>
-      <w:pPr>
-        <w:rPr>
-          <w:noProof/>
-          <w:lang w:val="en-NZ"/>
-        </w:rPr>
-      </w:pPr>
-      <w:r>
-        <w:rPr>
-          <w:noProof/>
-          <w:lang w:val="en-NZ"/>
-        </w:rPr>
-        <w:t>{poll:"Option A","Option B","Option C"}</w:t>
-      </w:r>
-    </w:p>
-    <w:p>
-      <w:pPr>
-        <w:rPr>
-          <w:noProof/>
-          <w:lang w:val="en-NZ"/>
-        </w:rPr>
-      </w:pPr>
-      <w:r>
-        <w:rPr>
-          <w:noProof/>
-          <w:lang w:val="en-NZ"/>
-        </w:rPr>
-        <w:t>{poll:"This","That"}</w:t>
-      </w:r>
-    </w:p>
-    <w:p>
-      <w:pPr>
-        <w:rPr>
-          <w:lang w:val="en-NZ"/>
-        </w:rPr>
-      </w:pPr>
+          <w:lang w:val="en-NZ"/>
+        </w:rPr>
+        <w:t xml:space="preserve">Multiple choice / ranking</w:t>
+      </w:r>
+    </w:p>
+    <w:p>
+      <w:pPr>
+        <w:rPr>
+          <w:lang w:val="en-NZ"/>
+        </w:rPr>
+      </w:pPr>
+      <w:r>
+        <w:rPr>
+          <w:lang w:val="en-NZ"/>
+        </w:rPr>
+        <w:t xml:space="preserve">Option A / Option B / Option C</w:t>
+      </w:r>
+    </w:p>
+    <w:p>
+      <w:pPr>
+        <w:rPr>
+          <w:lang w:val="en-NZ"/>
+        </w:rPr>
+      </w:pPr>
+      <w:r>
+        <w:rPr>
+          <w:lang w:val="en-NZ"/>
+        </w:rPr>
+        <w:t xml:space="preserve">This / That</w:t>
+      </w:r>
     </w:p>
     <w:p>
       <w:pPr>

</xml_diff>